<commit_message>
Remove training time and cost figures from report and defense slides
Drop run hours, training hours and dollar amounts from the abstract,
chapters 1, 3-6, the requirement table (NFR-02 now a compute
requirement), the hardware table and the cost analysis (actual budget
and buy-vs-rent removed; illustrative revenue model kept). Rebuild PDF,
DOCX, source zip and the PPTX.

Co-Authored-By: Claude Opus 5.5 <noreply@anthropic.com>
Claude-Session: https://claude.ai/code/session_01HBr9Z21HqQzxE1eaHUCYUM
</commit_message>
<xml_diff>
--- a/report/MedLift3D_Report.docx
+++ b/report/MedLift3D_Report.docx
@@ -122,7 +122,7 @@
         <w:t xml:space="preserve"> </w:t>
       </w:r>
       <w:r>
-        <w:t xml:space="preserve">of unmeasured information. MedLift-3D is a click-to-3D system that turns one click on a DTS slice into a 3D nodule measurement with a calibrated uncertainty. We first show from projection moments that every DTS view measures a nodule’s mass exactly, while its depth extent, which volume needs, is about 15 times worse conditioned; mass and mass doubling time are therefore the measurements DTS can support. The pipeline simulates low-dose 15-view DTS for 583 LIDC-IDRI patients (1,144 radiologist-annotated nodules), reconstructs a 64 mm prism through the chest around the click, fills the missing wedge with a 17.4-million-parameter conditional 3D diffusion model kept consistent with the X-rays, represents the nodule with 3D Gaussians that give its mass in closed form, and wraps every number in conformal prediction intervals and calibrated size-category probabilities. A learned 3D detector suggests where to click, and a seen/unseen (null-space) analysis explains which part of each measurement comes from the X-rays and which from the learned prior. The system components worked as specified: the diffusion prior raised nodule-region PSNR on held-out data from 11.88 dB to 15.23 dB, the detector reached a CPM of 0.298 against 0.017 for a training-free baseline, conformal intervals reached 95% coverage on 74 test nodules, and calibrated category probabilities lowered the Brier score for a volume of at least 100 mm³ from 0.54 to 0.17. The null-space analysis confirmed that the X-rays measure almost all of a nodule’s mass (0.3% unseen) and that the prior’s unseen content correlates with the truth (skill 0.22). The measurements, however, did not reach the goal: mass was not more accurate than volume, the full method’s volume error (MdAPE 94.6%) was not lower than physics-only reconstruction (87.7–91.2%), and the valid intervals were too wide to be useful. We trace these failures to a prior that shrinks faint nodules, to measuring mass in image space rather than from the projections, and to failed measurements inside the calibration set, and show that better image quality did not imply better measurement. The full study ran on one rented GPU in 15 hours for about US$20, and an interactive demo runs on a free Kaggle notebook.</w:t>
+        <w:t xml:space="preserve">of unmeasured information. MedLift-3D is a click-to-3D system that turns one click on a DTS slice into a 3D nodule measurement with a calibrated uncertainty. We first show from projection moments that every DTS view measures a nodule’s mass exactly, while its depth extent, which volume needs, is about 15 times worse conditioned; mass and mass doubling time are therefore the measurements DTS can support. The pipeline simulates low-dose 15-view DTS for 583 LIDC-IDRI patients (1,144 radiologist-annotated nodules), reconstructs a 64 mm prism through the chest around the click, fills the missing wedge with a 17.4-million-parameter conditional 3D diffusion model kept consistent with the X-rays, represents the nodule with 3D Gaussians that give its mass in closed form, and wraps every number in conformal prediction intervals and calibrated size-category probabilities. A learned 3D detector suggests where to click, and a seen/unseen (null-space) analysis explains which part of each measurement comes from the X-rays and which from the learned prior. The system components worked as specified: the diffusion prior raised nodule-region PSNR on held-out data from 11.88 dB to 15.23 dB, the detector reached a CPM of 0.298 against 0.017 for a training-free baseline, conformal intervals reached 95% coverage on 74 test nodules, and calibrated category probabilities lowered the Brier score for a volume of at least 100 mm³ from 0.54 to 0.17. The null-space analysis confirmed that the X-rays measure almost all of a nodule’s mass (0.3% unseen) and that the prior’s unseen content correlates with the truth (skill 0.22). The measurements, however, did not reach the goal: mass was not more accurate than volume, the full method’s volume error (MdAPE 94.6%) was not lower than physics-only reconstruction (87.7–91.2%), and the valid intervals were too wide to be useful. We trace these failures to a prior that shrinks faint nodules, to measuring mass in image space rather than from the projections, and to failed measurements inside the calibration set, and show that better image quality did not imply better measurement. An interactive demo runs on a free Kaggle notebook.</w:t>
       </w:r>
     </w:p>
     <w:p>
@@ -1127,7 +1127,7 @@
         <w:pStyle w:val="FirstParagraph"/>
       </w:pPr>
       <w:r>
-        <w:t xml:space="preserve">A verified, open pipeline of 18 scripted steps, each ending in automatic PASS/FAIL checks, from data download to final tables, figures and an HTML report. It contains a differentiable DTS simulator and projector, whole-chest and prism reconstruction, a trained conditional diffusion prior and nodule detector, Gaussian measurement, conformal calibration and an explainability module, covered by 69 unit tests and documented for rented cloud GPUs and free Kaggle notebooks. The full study runs on one rented GPU in about 15 hours for about US$20.</w:t>
+        <w:t xml:space="preserve">A verified, open pipeline of 18 scripted steps, each ending in automatic PASS/FAIL checks, from data download to final tables, figures and an HTML report. It contains a differentiable DTS simulator and projector, whole-chest and prism reconstruction, a trained conditional diffusion prior and nodule detector, Gaussian measurement, conformal calibration and an explainability module, covered by 69 unit tests and documented for rented cloud GPUs and free Kaggle notebooks.</w:t>
       </w:r>
     </w:p>
     <w:bookmarkEnd w:id="34"/>
@@ -6992,7 +6992,7 @@
         <w:t xml:space="preserve"> </w:t>
       </w:r>
       <w:r>
-        <w:t xml:space="preserve">Requirements were gathered from four sources: (i) the clinical guidelines that radiologists follow for nodules, namely the EUPS volume categories and the NELSON doubling-time categories [4, 11]; (ii) meetings with our supervisor; (iii) the published limits of DTS and sparse-view reconstruction (Chapter 2); and (iv) the constraints of a student project: public data only, no clinical scanner, a budget of tens of dollars and a fixed deadline. Table 3.1 lists the stakeholders and their needs.</w:t>
+        <w:t xml:space="preserve">Requirements were gathered from four sources: (i) the clinical guidelines that radiologists follow for nodules, namely the EUPS volume categories and the NELSON doubling-time categories [4, 11]; (ii) meetings with our supervisor; (iii) the published limits of DTS and sparse-view reconstruction (Chapter 2); and (iv) the constraints of a student project: public data only, no clinical scanner, limited computing resources and a fixed deadline. Table 3.1 lists the stakeholders and their needs.</w:t>
       </w:r>
     </w:p>
     <w:p>
@@ -7269,7 +7269,7 @@
               <w:rPr>
                 <w:sz w:val="19"/>
               </w:rPr>
-              <w:t xml:space="preserve">DTS hardware; software runs on a free or US$1.33/hour GPU</w:t>
+              <w:t xml:space="preserve">DTS hardware; software runs on a single free or rented GPU</w:t>
             </w:r>
           </w:p>
         </w:tc>
@@ -9032,9 +9032,9 @@
         </w:tblBorders>
       </w:tblPr>
       <w:tblGrid>
-        <w:gridCol w:w="1733"/>
-        <w:gridCol w:w="2961"/>
-        <w:gridCol w:w="4333"/>
+        <w:gridCol w:w="1593"/>
+        <w:gridCol w:w="3452"/>
+        <w:gridCol w:w="3983"/>
       </w:tblGrid>
       <w:tr>
         <w:trPr>
@@ -9042,7 +9042,7 @@
         </w:trPr>
         <w:tc>
           <w:tcPr>
-            <w:tcW w:type="dxa" w:w="1734"/>
+            <w:tcW w:type="dxa" w:w="1593"/>
           </w:tcPr>
           <w:p>
             <w:pPr>
@@ -9061,7 +9061,7 @@
         </w:tc>
         <w:tc>
           <w:tcPr>
-            <w:tcW w:type="dxa" w:w="2962"/>
+            <w:tcW w:type="dxa" w:w="3452"/>
           </w:tcPr>
           <w:p>
             <w:pPr>
@@ -9080,7 +9080,7 @@
         </w:tc>
         <w:tc>
           <w:tcPr>
-            <w:tcW w:type="dxa" w:w="4334"/>
+            <w:tcW w:type="dxa" w:w="3983"/>
           </w:tcPr>
           <w:p>
             <w:pPr>
@@ -9101,7 +9101,7 @@
       <w:tr>
         <w:tc>
           <w:tcPr>
-            <w:tcW w:type="dxa" w:w="1734"/>
+            <w:tcW w:type="dxa" w:w="1593"/>
           </w:tcPr>
           <w:p>
             <w:pPr>
@@ -9119,7 +9119,7 @@
         </w:tc>
         <w:tc>
           <w:tcPr>
-            <w:tcW w:type="dxa" w:w="2962"/>
+            <w:tcW w:type="dxa" w:w="3452"/>
           </w:tcPr>
           <w:p>
             <w:pPr>
@@ -9137,7 +9137,7 @@
         </w:tc>
         <w:tc>
           <w:tcPr>
-            <w:tcW w:type="dxa" w:w="4334"/>
+            <w:tcW w:type="dxa" w:w="3983"/>
           </w:tcPr>
           <w:p>
             <w:pPr>
@@ -9168,69 +9168,55 @@
       <w:tr>
         <w:tc>
           <w:tcPr>
-            <w:tcW w:type="dxa" w:w="1734"/>
-          </w:tcPr>
-          <w:p>
-            <w:pPr>
-              <w:pStyle w:val="Compact"/>
-              <w:spacing w:line="240" w:lineRule="auto" w:after="40"/>
-              <w:jc w:val="left"/>
-            </w:pPr>
-            <w:r>
-              <w:rPr>
-                <w:sz w:val="19"/>
-              </w:rPr>
-              <w:t xml:space="preserve">NFR-02 Cost</w:t>
-            </w:r>
-          </w:p>
-        </w:tc>
-        <w:tc>
-          <w:tcPr>
-            <w:tcW w:type="dxa" w:w="2962"/>
-          </w:tcPr>
-          <w:p>
-            <w:pPr>
-              <w:pStyle w:val="Compact"/>
-              <w:spacing w:line="240" w:lineRule="auto" w:after="40"/>
-              <w:jc w:val="left"/>
-            </w:pPr>
-            <w:r>
-              <w:rPr>
-                <w:sz w:val="19"/>
-              </w:rPr>
-              <w:t xml:space="preserve">The full study is affordable for students</w:t>
-            </w:r>
-          </w:p>
-        </w:tc>
-        <w:tc>
-          <w:tcPr>
-            <w:tcW w:type="dxa" w:w="4334"/>
-          </w:tcPr>
-          <w:p>
-            <w:pPr>
-              <w:pStyle w:val="Compact"/>
-              <w:spacing w:line="240" w:lineRule="auto" w:after="40"/>
-              <w:jc w:val="left"/>
-            </w:pPr>
-            <m:oMath>
-              <m:r>
-                <m:rPr>
-                  <m:sty m:val="p"/>
-                </m:rPr>
-                <m:t>≤</m:t>
-              </m:r>
-            </m:oMath>
-            <w:r>
-              <w:rPr>
-                <w:sz w:val="19"/>
-              </w:rPr>
-              <w:t xml:space="preserve"> </w:t>
-            </w:r>
-            <w:r>
-              <w:rPr>
-                <w:sz w:val="19"/>
-              </w:rPr>
-              <w:t xml:space="preserve">US$50 of rented GPU</w:t>
+            <w:tcW w:type="dxa" w:w="1593"/>
+          </w:tcPr>
+          <w:p>
+            <w:pPr>
+              <w:pStyle w:val="Compact"/>
+              <w:spacing w:line="240" w:lineRule="auto" w:after="40"/>
+              <w:jc w:val="left"/>
+            </w:pPr>
+            <w:r>
+              <w:rPr>
+                <w:sz w:val="19"/>
+              </w:rPr>
+              <w:t xml:space="preserve">NFR-02 Compute</w:t>
+            </w:r>
+          </w:p>
+        </w:tc>
+        <w:tc>
+          <w:tcPr>
+            <w:tcW w:type="dxa" w:w="3452"/>
+          </w:tcPr>
+          <w:p>
+            <w:pPr>
+              <w:pStyle w:val="Compact"/>
+              <w:spacing w:line="240" w:lineRule="auto" w:after="40"/>
+              <w:jc w:val="left"/>
+            </w:pPr>
+            <w:r>
+              <w:rPr>
+                <w:sz w:val="19"/>
+              </w:rPr>
+              <w:t xml:space="preserve">The study and the application run on modest hardware</w:t>
+            </w:r>
+          </w:p>
+        </w:tc>
+        <w:tc>
+          <w:tcPr>
+            <w:tcW w:type="dxa" w:w="3983"/>
+          </w:tcPr>
+          <w:p>
+            <w:pPr>
+              <w:pStyle w:val="Compact"/>
+              <w:spacing w:line="240" w:lineRule="auto" w:after="40"/>
+              <w:jc w:val="left"/>
+            </w:pPr>
+            <w:r>
+              <w:rPr>
+                <w:sz w:val="19"/>
+              </w:rPr>
+              <w:t xml:space="preserve">One GPU for the study; free GPU for the application</w:t>
             </w:r>
           </w:p>
         </w:tc>
@@ -9238,7 +9224,7 @@
       <w:tr>
         <w:tc>
           <w:tcPr>
-            <w:tcW w:type="dxa" w:w="1734"/>
+            <w:tcW w:type="dxa" w:w="1593"/>
           </w:tcPr>
           <w:p>
             <w:pPr>
@@ -9256,7 +9242,7 @@
         </w:tc>
         <w:tc>
           <w:tcPr>
-            <w:tcW w:type="dxa" w:w="2962"/>
+            <w:tcW w:type="dxa" w:w="3452"/>
           </w:tcPr>
           <w:p>
             <w:pPr>
@@ -9274,7 +9260,7 @@
         </w:tc>
         <w:tc>
           <w:tcPr>
-            <w:tcW w:type="dxa" w:w="4334"/>
+            <w:tcW w:type="dxa" w:w="3983"/>
           </w:tcPr>
           <w:p>
             <w:pPr>
@@ -9294,7 +9280,7 @@
       <w:tr>
         <w:tc>
           <w:tcPr>
-            <w:tcW w:type="dxa" w:w="1734"/>
+            <w:tcW w:type="dxa" w:w="1593"/>
           </w:tcPr>
           <w:p>
             <w:pPr>
@@ -9312,7 +9298,7 @@
         </w:tc>
         <w:tc>
           <w:tcPr>
-            <w:tcW w:type="dxa" w:w="2962"/>
+            <w:tcW w:type="dxa" w:w="3452"/>
           </w:tcPr>
           <w:p>
             <w:pPr>
@@ -9330,7 +9316,7 @@
         </w:tc>
         <w:tc>
           <w:tcPr>
-            <w:tcW w:type="dxa" w:w="4334"/>
+            <w:tcW w:type="dxa" w:w="3983"/>
           </w:tcPr>
           <w:p>
             <w:pPr>
@@ -9350,7 +9336,7 @@
       <w:tr>
         <w:tc>
           <w:tcPr>
-            <w:tcW w:type="dxa" w:w="1734"/>
+            <w:tcW w:type="dxa" w:w="1593"/>
           </w:tcPr>
           <w:p>
             <w:pPr>
@@ -9368,7 +9354,7 @@
         </w:tc>
         <w:tc>
           <w:tcPr>
-            <w:tcW w:type="dxa" w:w="2962"/>
+            <w:tcW w:type="dxa" w:w="3452"/>
           </w:tcPr>
           <w:p>
             <w:pPr>
@@ -9386,7 +9372,7 @@
         </w:tc>
         <w:tc>
           <w:tcPr>
-            <w:tcW w:type="dxa" w:w="4334"/>
+            <w:tcW w:type="dxa" w:w="3983"/>
           </w:tcPr>
           <w:p>
             <w:pPr>
@@ -9423,7 +9409,7 @@
       <w:tr>
         <w:tc>
           <w:tcPr>
-            <w:tcW w:type="dxa" w:w="1734"/>
+            <w:tcW w:type="dxa" w:w="1593"/>
           </w:tcPr>
           <w:p>
             <w:pPr>
@@ -9441,7 +9427,7 @@
         </w:tc>
         <w:tc>
           <w:tcPr>
-            <w:tcW w:type="dxa" w:w="2962"/>
+            <w:tcW w:type="dxa" w:w="3452"/>
           </w:tcPr>
           <w:p>
             <w:pPr>
@@ -9459,7 +9445,7 @@
         </w:tc>
         <w:tc>
           <w:tcPr>
-            <w:tcW w:type="dxa" w:w="4334"/>
+            <w:tcW w:type="dxa" w:w="3983"/>
           </w:tcPr>
           <w:p>
             <w:pPr>
@@ -9479,7 +9465,7 @@
       <w:tr>
         <w:tc>
           <w:tcPr>
-            <w:tcW w:type="dxa" w:w="1734"/>
+            <w:tcW w:type="dxa" w:w="1593"/>
           </w:tcPr>
           <w:p>
             <w:pPr>
@@ -9497,7 +9483,7 @@
         </w:tc>
         <w:tc>
           <w:tcPr>
-            <w:tcW w:type="dxa" w:w="2962"/>
+            <w:tcW w:type="dxa" w:w="3452"/>
           </w:tcPr>
           <w:p>
             <w:pPr>
@@ -9515,7 +9501,7 @@
         </w:tc>
         <w:tc>
           <w:tcPr>
-            <w:tcW w:type="dxa" w:w="4334"/>
+            <w:tcW w:type="dxa" w:w="3983"/>
           </w:tcPr>
           <w:p>
             <w:pPr>
@@ -9558,7 +9544,7 @@
       <w:tr>
         <w:tc>
           <w:tcPr>
-            <w:tcW w:type="dxa" w:w="1734"/>
+            <w:tcW w:type="dxa" w:w="1593"/>
           </w:tcPr>
           <w:p>
             <w:pPr>
@@ -9576,7 +9562,7 @@
         </w:tc>
         <w:tc>
           <w:tcPr>
-            <w:tcW w:type="dxa" w:w="2962"/>
+            <w:tcW w:type="dxa" w:w="3452"/>
           </w:tcPr>
           <w:p>
             <w:pPr>
@@ -9594,7 +9580,7 @@
         </w:tc>
         <w:tc>
           <w:tcPr>
-            <w:tcW w:type="dxa" w:w="4334"/>
+            <w:tcW w:type="dxa" w:w="3983"/>
           </w:tcPr>
           <w:p>
             <w:pPr>
@@ -13842,7 +13828,7 @@
               <w:rPr>
                 <w:sz w:val="19"/>
               </w:rPr>
-              <w:t xml:space="preserve">Too large to train and verify in time and budget; evaluated by generative losses, not clinical numbers</w:t>
+              <w:t xml:space="preserve">Too large to train and verify with our resources; evaluated by generative losses, not clinical numbers</w:t>
             </w:r>
           </w:p>
         </w:tc>
@@ -15043,10 +15029,10 @@
         </w:tblBorders>
       </w:tblPr>
       <w:tblGrid>
-        <w:gridCol w:w="1631"/>
-        <w:gridCol w:w="4662"/>
-        <w:gridCol w:w="1616"/>
-        <w:gridCol w:w="1118"/>
+        <w:gridCol w:w="1702"/>
+        <w:gridCol w:w="4863"/>
+        <w:gridCol w:w="1685"/>
+        <w:gridCol w:w="778"/>
       </w:tblGrid>
       <w:tr>
         <w:trPr>
@@ -15054,7 +15040,7 @@
         </w:trPr>
         <w:tc>
           <w:tcPr>
-            <w:tcW w:type="dxa" w:w="1632"/>
+            <w:tcW w:type="dxa" w:w="1702"/>
           </w:tcPr>
           <w:p>
             <w:pPr>
@@ -15073,7 +15059,7 @@
         </w:tc>
         <w:tc>
           <w:tcPr>
-            <w:tcW w:type="dxa" w:w="4662"/>
+            <w:tcW w:type="dxa" w:w="4863"/>
           </w:tcPr>
           <w:p>
             <w:pPr>
@@ -15092,7 +15078,7 @@
         </w:tc>
         <w:tc>
           <w:tcPr>
-            <w:tcW w:type="dxa" w:w="1616"/>
+            <w:tcW w:type="dxa" w:w="1686"/>
           </w:tcPr>
           <w:p>
             <w:pPr>
@@ -15111,7 +15097,7 @@
         </w:tc>
         <w:tc>
           <w:tcPr>
-            <w:tcW w:type="dxa" w:w="1119"/>
+            <w:tcW w:type="dxa" w:w="778"/>
           </w:tcPr>
           <w:p>
             <w:pPr>
@@ -15124,7 +15110,7 @@
                 <w:b/>
                 <w:sz w:val="19"/>
               </w:rPr>
-              <w:t xml:space="preserve">Cost</w:t>
+              <w:t xml:space="preserve">Access</w:t>
             </w:r>
           </w:p>
         </w:tc>
@@ -15132,7 +15118,7 @@
       <w:tr>
         <w:tc>
           <w:tcPr>
-            <w:tcW w:type="dxa" w:w="1632"/>
+            <w:tcW w:type="dxa" w:w="1702"/>
           </w:tcPr>
           <w:p>
             <w:pPr>
@@ -15150,7 +15136,7 @@
         </w:tc>
         <w:tc>
           <w:tcPr>
-            <w:tcW w:type="dxa" w:w="4662"/>
+            <w:tcW w:type="dxa" w:w="4863"/>
           </w:tcPr>
           <w:p>
             <w:pPr>
@@ -15168,7 +15154,7 @@
         </w:tc>
         <w:tc>
           <w:tcPr>
-            <w:tcW w:type="dxa" w:w="1616"/>
+            <w:tcW w:type="dxa" w:w="1686"/>
           </w:tcPr>
           <w:p>
             <w:pPr>
@@ -15186,7 +15172,7 @@
         </w:tc>
         <w:tc>
           <w:tcPr>
-            <w:tcW w:type="dxa" w:w="1119"/>
+            <w:tcW w:type="dxa" w:w="778"/>
           </w:tcPr>
           <w:p>
             <w:pPr>
@@ -15206,7 +15192,7 @@
       <w:tr>
         <w:tc>
           <w:tcPr>
-            <w:tcW w:type="dxa" w:w="1632"/>
+            <w:tcW w:type="dxa" w:w="1702"/>
           </w:tcPr>
           <w:p>
             <w:pPr>
@@ -15224,7 +15210,7 @@
         </w:tc>
         <w:tc>
           <w:tcPr>
-            <w:tcW w:type="dxa" w:w="4662"/>
+            <w:tcW w:type="dxa" w:w="4863"/>
           </w:tcPr>
           <w:p>
             <w:pPr>
@@ -15242,7 +15228,7 @@
         </w:tc>
         <w:tc>
           <w:tcPr>
-            <w:tcW w:type="dxa" w:w="1616"/>
+            <w:tcW w:type="dxa" w:w="1686"/>
           </w:tcPr>
           <w:p>
             <w:pPr>
@@ -15277,7 +15263,7 @@
         </w:tc>
         <w:tc>
           <w:tcPr>
-            <w:tcW w:type="dxa" w:w="1119"/>
+            <w:tcW w:type="dxa" w:w="778"/>
           </w:tcPr>
           <w:p>
             <w:pPr>
@@ -15297,7 +15283,7 @@
       <w:tr>
         <w:tc>
           <w:tcPr>
-            <w:tcW w:type="dxa" w:w="1632"/>
+            <w:tcW w:type="dxa" w:w="1702"/>
           </w:tcPr>
           <w:p>
             <w:pPr>
@@ -15315,7 +15301,7 @@
         </w:tc>
         <w:tc>
           <w:tcPr>
-            <w:tcW w:type="dxa" w:w="4662"/>
+            <w:tcW w:type="dxa" w:w="4863"/>
           </w:tcPr>
           <w:p>
             <w:pPr>
@@ -15333,7 +15319,7 @@
         </w:tc>
         <w:tc>
           <w:tcPr>
-            <w:tcW w:type="dxa" w:w="1616"/>
+            <w:tcW w:type="dxa" w:w="1686"/>
           </w:tcPr>
           <w:p>
             <w:pPr>
@@ -15351,33 +15337,19 @@
         </w:tc>
         <w:tc>
           <w:tcPr>
-            <w:tcW w:type="dxa" w:w="1119"/>
-          </w:tcPr>
-          <w:p>
-            <w:pPr>
-              <w:pStyle w:val="Compact"/>
-              <w:spacing w:line="240" w:lineRule="auto" w:after="40"/>
-              <w:jc w:val="left"/>
-            </w:pPr>
-            <m:oMath>
-              <m:r>
-                <m:rPr>
-                  <m:sty m:val="p"/>
-                </m:rPr>
-                <m:t>&lt;</m:t>
-              </m:r>
-            </m:oMath>
-            <w:r>
-              <w:rPr>
-                <w:sz w:val="19"/>
-              </w:rPr>
-              <w:t xml:space="preserve"> </w:t>
-            </w:r>
-            <w:r>
-              <w:rPr>
-                <w:sz w:val="19"/>
-              </w:rPr>
-              <w:t xml:space="preserve">US$2</w:t>
+            <w:tcW w:type="dxa" w:w="778"/>
+          </w:tcPr>
+          <w:p>
+            <w:pPr>
+              <w:pStyle w:val="Compact"/>
+              <w:spacing w:line="240" w:lineRule="auto" w:after="40"/>
+              <w:jc w:val="left"/>
+            </w:pPr>
+            <w:r>
+              <w:rPr>
+                <w:sz w:val="19"/>
+              </w:rPr>
+              <w:t xml:space="preserve">Rented</w:t>
             </w:r>
           </w:p>
         </w:tc>
@@ -15385,7 +15357,7 @@
       <w:tr>
         <w:tc>
           <w:tcPr>
-            <w:tcW w:type="dxa" w:w="1632"/>
+            <w:tcW w:type="dxa" w:w="1702"/>
           </w:tcPr>
           <w:p>
             <w:pPr>
@@ -15403,7 +15375,7 @@
         </w:tc>
         <w:tc>
           <w:tcPr>
-            <w:tcW w:type="dxa" w:w="4662"/>
+            <w:tcW w:type="dxa" w:w="4863"/>
           </w:tcPr>
           <w:p>
             <w:pPr>
@@ -15421,7 +15393,7 @@
         </w:tc>
         <w:tc>
           <w:tcPr>
-            <w:tcW w:type="dxa" w:w="1616"/>
+            <w:tcW w:type="dxa" w:w="1686"/>
           </w:tcPr>
           <w:p>
             <w:pPr>
@@ -15439,19 +15411,19 @@
         </w:tc>
         <w:tc>
           <w:tcPr>
-            <w:tcW w:type="dxa" w:w="1119"/>
-          </w:tcPr>
-          <w:p>
-            <w:pPr>
-              <w:pStyle w:val="Compact"/>
-              <w:spacing w:line="240" w:lineRule="auto" w:after="40"/>
-              <w:jc w:val="left"/>
-            </w:pPr>
-            <w:r>
-              <w:rPr>
-                <w:sz w:val="19"/>
-              </w:rPr>
-              <w:t xml:space="preserve">US$1.33/h</w:t>
+            <w:tcW w:type="dxa" w:w="778"/>
+          </w:tcPr>
+          <w:p>
+            <w:pPr>
+              <w:pStyle w:val="Compact"/>
+              <w:spacing w:line="240" w:lineRule="auto" w:after="40"/>
+              <w:jc w:val="left"/>
+            </w:pPr>
+            <w:r>
+              <w:rPr>
+                <w:sz w:val="19"/>
+              </w:rPr>
+              <w:t xml:space="preserve">Rented</w:t>
             </w:r>
           </w:p>
         </w:tc>
@@ -15459,7 +15431,7 @@
       <w:tr>
         <w:tc>
           <w:tcPr>
-            <w:tcW w:type="dxa" w:w="1632"/>
+            <w:tcW w:type="dxa" w:w="1702"/>
           </w:tcPr>
           <w:p>
             <w:pPr>
@@ -15477,7 +15449,7 @@
         </w:tc>
         <w:tc>
           <w:tcPr>
-            <w:tcW w:type="dxa" w:w="4662"/>
+            <w:tcW w:type="dxa" w:w="4863"/>
           </w:tcPr>
           <w:p>
             <w:pPr>
@@ -15495,7 +15467,7 @@
         </w:tc>
         <w:tc>
           <w:tcPr>
-            <w:tcW w:type="dxa" w:w="1616"/>
+            <w:tcW w:type="dxa" w:w="1686"/>
           </w:tcPr>
           <w:p>
             <w:pPr>
@@ -15513,19 +15485,19 @@
         </w:tc>
         <w:tc>
           <w:tcPr>
-            <w:tcW w:type="dxa" w:w="1119"/>
-          </w:tcPr>
-          <w:p>
-            <w:pPr>
-              <w:pStyle w:val="Compact"/>
-              <w:spacing w:line="240" w:lineRule="auto" w:after="40"/>
-              <w:jc w:val="left"/>
-            </w:pPr>
-            <w:r>
-              <w:rPr>
-                <w:sz w:val="19"/>
-              </w:rPr>
-              <w:t xml:space="preserve">included</w:t>
+            <w:tcW w:type="dxa" w:w="778"/>
+          </w:tcPr>
+          <w:p>
+            <w:pPr>
+              <w:pStyle w:val="Compact"/>
+              <w:spacing w:line="240" w:lineRule="auto" w:after="40"/>
+              <w:jc w:val="left"/>
+            </w:pPr>
+            <w:r>
+              <w:rPr>
+                <w:sz w:val="19"/>
+              </w:rPr>
+              <w:t xml:space="preserve">Rented</w:t>
             </w:r>
           </w:p>
         </w:tc>
@@ -16141,7 +16113,7 @@
               <w:rPr>
                 <w:sz w:val="19"/>
               </w:rPr>
-              <w:t xml:space="preserve">Unattended 15-hour run with resume and backups</w:t>
+              <w:t xml:space="preserve">Unattended long run with resume and backups</w:t>
             </w:r>
           </w:p>
         </w:tc>
@@ -18878,25 +18850,11 @@
               <w:spacing w:line="240" w:lineRule="auto" w:after="40"/>
               <w:jc w:val="left"/>
             </w:pPr>
-            <m:oMath>
-              <m:r>
-                <m:rPr>
-                  <m:sty m:val="p"/>
-                </m:rPr>
-                <m:t>≤</m:t>
-              </m:r>
-            </m:oMath>
-            <w:r>
-              <w:rPr>
-                <w:sz w:val="19"/>
-              </w:rPr>
-              <w:t xml:space="preserve"> </w:t>
-            </w:r>
-            <w:r>
-              <w:rPr>
-                <w:sz w:val="19"/>
-              </w:rPr>
-              <w:t xml:space="preserve">US$50</w:t>
+            <w:r>
+              <w:rPr>
+                <w:sz w:val="19"/>
+              </w:rPr>
+              <w:t xml:space="preserve">One GPU; free GPU for the app</w:t>
             </w:r>
           </w:p>
         </w:tc>
@@ -18914,7 +18872,7 @@
               <w:rPr>
                 <w:sz w:val="19"/>
               </w:rPr>
-              <w:t xml:space="preserve">about US$20 for the full run</w:t>
+              <w:t xml:space="preserve">Full study on one L40S; application on a free Kaggle notebook</w:t>
             </w:r>
           </w:p>
         </w:tc>
@@ -19250,7 +19208,7 @@
         <w:pStyle w:val="FirstParagraph"/>
       </w:pPr>
       <w:r>
-        <w:t xml:space="preserve">The results are presented in the order of the pipeline: the training and fit of the diffusion prior, nodule detection, measurement accuracy (H1, H2), calibrated uncertainty (H3, H5), growth (H4) and explainability (H6), followed by a discussion of why the measurements failed, the sensitivity to the acquisition geometry, and the run time and cost. The measurement results use 150 nodules (76 calibration, 74 test); detection uses all 225 test nodules.</w:t>
+        <w:t xml:space="preserve">The results are presented in the order of the pipeline: the training and fit of the diffusion prior, nodule detection, measurement accuracy (H1, H2), calibrated uncertainty (H3, H5), growth (H4) and explainability (H6), followed by a discussion of why the measurements failed, the sensitivity to the acquisition geometry, and the application. The measurement results use 150 nodules (76 calibration, 74 test); detection uses all 225 test nodules.</w:t>
       </w:r>
     </w:p>
     <w:bookmarkStart w:id="131" w:name="diffusion-prior-training-and-fit"/>
@@ -19267,7 +19225,7 @@
         <w:pStyle w:val="FirstParagraph"/>
       </w:pPr>
       <w:r>
-        <w:t xml:space="preserve">The prior was trained on 2,522 pairs (265 held out) for 27,610 steps within its 6-hour budget (batch 8, about 0.77 s per step); the loss fell from 0.1186 to 0.0476 (last 10% vs first 10% of steps). On held-out pairs its samples reached 15.23 dB PSNR in the nodule box against 11.88 dB for the physics-only input (+3.35 dB) and 13.74 vs 10.16 dB over the whole prism (Figure 4.6). The fit check (Figure 4.7) gives two messages. The denoising loss at fixed noise levels was nearly the same on training and held-out pairs (0.0342 vs 0.0331, ratio 0.97), so the network did not memorise its inputs; but the sample quality gain was larger on training patients than on held-out ones (+7.00 vs +4.22 dB), so its samples are better for patients it has seen. The held-out gain was still rising at the end (+1.89 to +3.35 dB over the last checks), so the prior is also under-trained.</w:t>
+        <w:t xml:space="preserve">The prior was trained on 2,522 pairs (265 held out) for 27,610 steps (batch 8); the loss fell from 0.1186 to 0.0476 (last 10% vs first 10% of steps). On held-out pairs its samples reached 15.23 dB PSNR in the nodule box against 11.88 dB for the physics-only input (+3.35 dB) and 13.74 vs 10.16 dB over the whole prism (Figure 4.6). The fit check (Figure 4.7) gives two messages. The denoising loss at fixed noise levels was nearly the same on training and held-out pairs (0.0342 vs 0.0331, ratio 0.97), so the network did not memorise its inputs; but the sample quality gain was larger on training patients than on held-out ones (+7.00 vs +4.22 dB), so its samples are better for patients it has seen. The held-out gain was still rising at the end (+1.89 to +3.35 dB over the last checks), so the prior is also under-trained.</w:t>
       </w:r>
     </w:p>
     <w:p>
@@ -27635,13 +27593,13 @@
       </w:r>
     </w:p>
     <w:bookmarkEnd w:id="174"/>
-    <w:bookmarkStart w:id="190" w:name="run-time-cost-and-application"/>
+    <w:bookmarkStart w:id="190" w:name="application"/>
     <w:p>
       <w:pPr>
         <w:pStyle w:val="Heading3"/>
       </w:pPr>
       <w:r>
-        <w:t xml:space="preserve">4.3.9 Run Time, Cost and Application</w:t>
+        <w:t xml:space="preserve">4.3.9 Application</w:t>
       </w:r>
     </w:p>
     <w:p>
@@ -27649,7 +27607,7 @@
         <w:pStyle w:val="FirstParagraph"/>
       </w:pPr>
       <w:r>
-        <w:t xml:space="preserve">The full run took about 15 hours on one RunPod L40S GPU at US$1.33 per hour, about US$20 in total, including 6 hours of diffusion training and about 18 minutes for the detector; measuring one nodule with all five reconstruction methods took a median of 45.5 s. The application loads the trained models on a free Kaggle notebook and is reached from a browser through an HTTPS tunnel. For a click on an annotated nodule it returns mass and volume with intervals, the EUPS category with probabilities, the prism views with the sample spread, and an interactive 3D view in which the reconstruction is coloured by the disagreement of the eight samples and the radiologists’ nodule is shown in grey (Figure 4.20); in both views the uncertainty is largest in depth, as the physics predicts. A click where no nodule exists returns</w:t>
+        <w:t xml:space="preserve">Measuring one nodule with all five reconstruction methods took a median of 45.5 s. The application loads the trained models on a free Kaggle notebook and is reached from a browser through an HTTPS tunnel. For a click on an annotated nodule it returns mass and volume with intervals, the EUPS category with probabilities, the prism views with the sample spread, and an interactive 3D view in which the reconstruction is coloured by the disagreement of the eight samples and the radiologists’ nodule is shown in grey (Figure 4.20); in both views the uncertainty is largest in depth, as the physics predicts. A click where no nodule exists returns</w:t>
       </w:r>
       <w:r>
         <w:t xml:space="preserve"> </w:t>
@@ -29661,7 +29619,7 @@
         <w:pStyle w:val="FirstParagraph"/>
       </w:pPr>
       <w:r>
-        <w:t xml:space="preserve">The project had no external funding, so all computation had to fit a student budget. Free resources were used wherever possible (laptop CPU, Kaggle GPUs for the pilot and the application), CPU-only steps (3–5 hours of download and case building) were moved to a cheap CPU machine, and GPU training was given a fixed 6-hour budget. The full study cost about US$20 on the GPU and under US$2 on the CPU machine. Clinically, the economic case rests on DTS: a DTS-capable radiography room costs a fraction of a CT scanner and examines patients faster, so follow-up by DTS can lower the cost of each follow-up for hospitals and patients.</w:t>
+        <w:t xml:space="preserve">The project had no external funding, so all computation had to fit a student budget. Free resources were used wherever possible (laptop CPU, Kaggle GPUs for the pilot and the application), CPU-only steps (download and case building) were moved to a cheap CPU machine, and GPU training was given a fixed compute budget. Clinically, the economic case rests on DTS: a DTS-capable radiography room costs a fraction of a CT scanner and examines patients faster, so follow-up by DTS can lower the cost of each follow-up for hospitals and patients.</w:t>
       </w:r>
     </w:p>
     <w:bookmarkEnd w:id="198"/>
@@ -29689,7 +29647,7 @@
         <w:t xml:space="preserve"> </w:t>
       </w:r>
       <w:r>
-        <w:t xml:space="preserve">The L40S GPU has a 350 W power limit, so the 15-hour run used at most about 5.3 kWh on the GPU, roughly 7.5 kWh including CPU, memory and cooling, plus under 1 kWh for the CPU machine. At a world-average grid intensity of about 0.48 kg CO</w:t>
+        <w:t xml:space="preserve">The L40S GPU has a 350 W power limit, and the whole study ran on this single GPU, so its energy use and emissions (at a grid intensity of about 0.48 kg CO</w:t>
       </w:r>
       <m:oMath>
         <m:sSub>
@@ -29709,24 +29667,7 @@
         <w:t xml:space="preserve"> </w:t>
       </w:r>
       <w:r>
-        <w:t xml:space="preserve">per kWh (Bangladesh’s grid is higher, about 0.6), the study emitted roughly 4–5.5 kg CO</w:t>
-      </w:r>
-      <m:oMath>
-        <m:sSub>
-          <m:e>
-            <m:r>
-              <m:t>​</m:t>
-            </m:r>
-          </m:e>
-          <m:sub>
-            <m:r>
-              <m:t>2</m:t>
-            </m:r>
-          </m:sub>
-        </m:sSub>
-      </m:oMath>
-      <w:r>
-        <w:t xml:space="preserve">, comparable to a 25–35 km car trip. One measurement (about 45 s on the GPU) uses about 0.004 kWh. These are estimates from rated power, following [62], not metered values.</w:t>
+        <w:t xml:space="preserve">per kWh worldwide and about 0.6 in Bangladesh) were small. One measurement (about 45 s on the GPU) uses about 0.004 kWh. These are estimates from rated power, following [62], not metered values.</w:t>
       </w:r>
     </w:p>
     <w:p>
@@ -30972,30 +30913,13 @@
           <w:bCs/>
           <w:b/>
         </w:rPr>
-        <w:t xml:space="preserve">Actual project budget.</w:t>
-      </w:r>
-      <w:r>
-        <w:t xml:space="preserve"> </w:t>
-      </w:r>
-      <w:r>
-        <w:t xml:space="preserve">Table 5.5 gives the actual cost of the computation (exchange rate assumed: US$1</w:t>
-      </w:r>
-      <w:r>
-        <w:t xml:space="preserve"> </w:t>
-      </w:r>
-      <m:oMath>
-        <m:r>
-          <m:rPr>
-            <m:sty m:val="p"/>
-          </m:rPr>
-          <m:t>≈</m:t>
-        </m:r>
-      </m:oMath>
-      <w:r>
-        <w:t xml:space="preserve"> </w:t>
-      </w:r>
-      <w:r>
-        <w:t xml:space="preserve">BDT 120).</w:t>
+        <w:t xml:space="preserve">Revenue model (illustrative).</w:t>
+      </w:r>
+      <w:r>
+        <w:t xml:space="preserve"> </w:t>
+      </w:r>
+      <w:r>
+        <w:t xml:space="preserve">For a commercial version, assume 18 months of validation and registration and customers among diagnostic centres and hospitals with DTS-capable radiography (Tables 5.5 and 5.6).</w:t>
       </w:r>
     </w:p>
     <w:p>
@@ -31012,469 +30936,6 @@
           <w:sz w:val="20"/>
         </w:rPr>
         <w:t xml:space="preserve">Table 5.5:</w:t>
-      </w:r>
-      <w:r>
-        <w:rPr>
-          <w:iCs/>
-          <w:i/>
-          <w:sz w:val="20"/>
-        </w:rPr>
-        <w:t xml:space="preserve"> </w:t>
-      </w:r>
-      <w:r>
-        <w:rPr>
-          <w:iCs/>
-          <w:i/>
-          <w:sz w:val="20"/>
-        </w:rPr>
-        <w:t xml:space="preserve">Actual project budget.</w:t>
-      </w:r>
-    </w:p>
-    <w:tbl>
-      <w:tblPr>
-        <w:tblStyle w:val="Table"/>
-        <w:tblW w:type="auto" w:w="0"/>
-        <w:tblLook w:firstRow="1" w:lastRow="0" w:firstColumn="0" w:lastColumn="0" w:noHBand="0" w:noVBand="0" w:val="0020"/>
-        <w:jc w:val="start"/>
-        <w:tblBorders>
-          <w:top w:val="single" w:sz="12" w:color="000000"/>
-          <w:bottom w:val="single" w:sz="12" w:color="000000"/>
-          <w:insideH w:val="single" w:sz="6" w:color="808080"/>
-        </w:tblBorders>
-      </w:tblPr>
-      <w:tblGrid>
-        <w:gridCol w:w="6429"/>
-        <w:gridCol w:w="1094"/>
-        <w:gridCol w:w="1504"/>
-      </w:tblGrid>
-      <w:tr>
-        <w:trPr>
-          <w:tblHeader w:val="true"/>
-        </w:trPr>
-        <w:tc>
-          <w:tcPr>
-            <w:tcW w:type="dxa" w:w="6430"/>
-          </w:tcPr>
-          <w:p>
-            <w:pPr>
-              <w:pStyle w:val="Compact"/>
-              <w:spacing w:line="240" w:lineRule="auto" w:after="40"/>
-              <w:jc w:val="left"/>
-            </w:pPr>
-            <w:r>
-              <w:rPr>
-                <w:b/>
-                <w:sz w:val="19"/>
-              </w:rPr>
-              <w:t xml:space="preserve">Item</w:t>
-            </w:r>
-          </w:p>
-        </w:tc>
-        <w:tc>
-          <w:tcPr>
-            <w:tcW w:type="dxa" w:w="1094"/>
-          </w:tcPr>
-          <w:p>
-            <w:pPr>
-              <w:pStyle w:val="Compact"/>
-              <w:spacing w:line="240" w:lineRule="auto" w:after="40"/>
-              <w:jc w:val="right"/>
-            </w:pPr>
-            <w:r>
-              <w:rPr>
-                <w:b/>
-                <w:sz w:val="19"/>
-              </w:rPr>
-              <w:t xml:space="preserve">US$</w:t>
-            </w:r>
-          </w:p>
-        </w:tc>
-        <w:tc>
-          <w:tcPr>
-            <w:tcW w:type="dxa" w:w="1505"/>
-          </w:tcPr>
-          <w:p>
-            <w:pPr>
-              <w:pStyle w:val="Compact"/>
-              <w:spacing w:line="240" w:lineRule="auto" w:after="40"/>
-              <w:jc w:val="right"/>
-            </w:pPr>
-            <w:r>
-              <w:rPr>
-                <w:b/>
-                <w:sz w:val="19"/>
-              </w:rPr>
-              <w:t xml:space="preserve">BDT</w:t>
-            </w:r>
-          </w:p>
-        </w:tc>
-      </w:tr>
-      <w:tr>
-        <w:tc>
-          <w:tcPr>
-            <w:tcW w:type="dxa" w:w="6430"/>
-          </w:tcPr>
-          <w:p>
-            <w:pPr>
-              <w:pStyle w:val="Compact"/>
-              <w:spacing w:line="240" w:lineRule="auto" w:after="40"/>
-              <w:jc w:val="left"/>
-            </w:pPr>
-            <w:r>
-              <w:rPr>
-                <w:sz w:val="19"/>
-              </w:rPr>
-              <w:t xml:space="preserve">RunPod GPU (L40S, 15 hours at US$1.33 per hour)</w:t>
-            </w:r>
-          </w:p>
-        </w:tc>
-        <w:tc>
-          <w:tcPr>
-            <w:tcW w:type="dxa" w:w="1094"/>
-          </w:tcPr>
-          <w:p>
-            <w:pPr>
-              <w:pStyle w:val="Compact"/>
-              <w:spacing w:line="240" w:lineRule="auto" w:after="40"/>
-              <w:jc w:val="right"/>
-            </w:pPr>
-            <m:oMath>
-              <m:r>
-                <m:rPr>
-                  <m:sty m:val="p"/>
-                </m:rPr>
-                <m:t>≈</m:t>
-              </m:r>
-              <m:r>
-                <m:t>20</m:t>
-              </m:r>
-            </m:oMath>
-          </w:p>
-        </w:tc>
-        <w:tc>
-          <w:tcPr>
-            <w:tcW w:type="dxa" w:w="1505"/>
-          </w:tcPr>
-          <w:p>
-            <w:pPr>
-              <w:pStyle w:val="Compact"/>
-              <w:spacing w:line="240" w:lineRule="auto" w:after="40"/>
-              <w:jc w:val="right"/>
-            </w:pPr>
-            <m:oMath>
-              <m:r>
-                <m:rPr>
-                  <m:sty m:val="p"/>
-                </m:rPr>
-                <m:t>≈</m:t>
-              </m:r>
-              <m:r>
-                <m:t>2</m:t>
-              </m:r>
-              <m:r>
-                <m:rPr>
-                  <m:sty m:val="p"/>
-                </m:rPr>
-                <m:t>,</m:t>
-              </m:r>
-              <m:r>
-                <m:t>400</m:t>
-              </m:r>
-            </m:oMath>
-          </w:p>
-        </w:tc>
-      </w:tr>
-      <w:tr>
-        <w:tc>
-          <w:tcPr>
-            <w:tcW w:type="dxa" w:w="6430"/>
-          </w:tcPr>
-          <w:p>
-            <w:pPr>
-              <w:pStyle w:val="Compact"/>
-              <w:spacing w:line="240" w:lineRule="auto" w:after="40"/>
-              <w:jc w:val="left"/>
-            </w:pPr>
-            <w:r>
-              <w:rPr>
-                <w:sz w:val="19"/>
-              </w:rPr>
-              <w:t xml:space="preserve">RunPod CPU machine (download and case building)</w:t>
-            </w:r>
-          </w:p>
-        </w:tc>
-        <w:tc>
-          <w:tcPr>
-            <w:tcW w:type="dxa" w:w="1094"/>
-          </w:tcPr>
-          <w:p>
-            <w:pPr>
-              <w:pStyle w:val="Compact"/>
-              <w:spacing w:line="240" w:lineRule="auto" w:after="40"/>
-              <w:jc w:val="right"/>
-            </w:pPr>
-            <m:oMath>
-              <m:r>
-                <m:rPr>
-                  <m:sty m:val="p"/>
-                </m:rPr>
-                <m:t>&lt;</m:t>
-              </m:r>
-              <m:r>
-                <m:t>2</m:t>
-              </m:r>
-            </m:oMath>
-          </w:p>
-        </w:tc>
-        <w:tc>
-          <w:tcPr>
-            <w:tcW w:type="dxa" w:w="1505"/>
-          </w:tcPr>
-          <w:p>
-            <w:pPr>
-              <w:pStyle w:val="Compact"/>
-              <w:spacing w:line="240" w:lineRule="auto" w:after="40"/>
-              <w:jc w:val="right"/>
-            </w:pPr>
-            <m:oMath>
-              <m:r>
-                <m:rPr>
-                  <m:sty m:val="p"/>
-                </m:rPr>
-                <m:t>&lt;</m:t>
-              </m:r>
-              <m:r>
-                <m:t>240</m:t>
-              </m:r>
-            </m:oMath>
-          </w:p>
-        </w:tc>
-      </w:tr>
-      <w:tr>
-        <w:tc>
-          <w:tcPr>
-            <w:tcW w:type="dxa" w:w="6430"/>
-          </w:tcPr>
-          <w:p>
-            <w:pPr>
-              <w:pStyle w:val="Compact"/>
-              <w:spacing w:line="240" w:lineRule="auto" w:after="40"/>
-              <w:jc w:val="left"/>
-            </w:pPr>
-            <w:r>
-              <w:rPr>
-                <w:sz w:val="19"/>
-              </w:rPr>
-              <w:t xml:space="preserve">Kaggle notebooks (pilot, application)</w:t>
-            </w:r>
-          </w:p>
-        </w:tc>
-        <w:tc>
-          <w:tcPr>
-            <w:tcW w:type="dxa" w:w="1094"/>
-          </w:tcPr>
-          <w:p>
-            <w:pPr>
-              <w:pStyle w:val="Compact"/>
-              <w:spacing w:line="240" w:lineRule="auto" w:after="40"/>
-              <w:jc w:val="right"/>
-            </w:pPr>
-            <w:r>
-              <w:rPr>
-                <w:sz w:val="19"/>
-              </w:rPr>
-              <w:t xml:space="preserve">0</w:t>
-            </w:r>
-          </w:p>
-        </w:tc>
-        <w:tc>
-          <w:tcPr>
-            <w:tcW w:type="dxa" w:w="1505"/>
-          </w:tcPr>
-          <w:p>
-            <w:pPr>
-              <w:pStyle w:val="Compact"/>
-              <w:spacing w:line="240" w:lineRule="auto" w:after="40"/>
-              <w:jc w:val="right"/>
-            </w:pPr>
-            <w:r>
-              <w:rPr>
-                <w:sz w:val="19"/>
-              </w:rPr>
-              <w:t xml:space="preserve">0</w:t>
-            </w:r>
-          </w:p>
-        </w:tc>
-      </w:tr>
-      <w:tr>
-        <w:tc>
-          <w:tcPr>
-            <w:tcW w:type="dxa" w:w="6430"/>
-          </w:tcPr>
-          <w:p>
-            <w:pPr>
-              <w:pStyle w:val="Compact"/>
-              <w:spacing w:line="240" w:lineRule="auto" w:after="40"/>
-              <w:jc w:val="left"/>
-            </w:pPr>
-            <w:r>
-              <w:rPr>
-                <w:sz w:val="19"/>
-              </w:rPr>
-              <w:t xml:space="preserve">LIDC-IDRI data and open-source software</w:t>
-            </w:r>
-          </w:p>
-        </w:tc>
-        <w:tc>
-          <w:tcPr>
-            <w:tcW w:type="dxa" w:w="1094"/>
-          </w:tcPr>
-          <w:p>
-            <w:pPr>
-              <w:pStyle w:val="Compact"/>
-              <w:spacing w:line="240" w:lineRule="auto" w:after="40"/>
-              <w:jc w:val="right"/>
-            </w:pPr>
-            <w:r>
-              <w:rPr>
-                <w:sz w:val="19"/>
-              </w:rPr>
-              <w:t xml:space="preserve">0</w:t>
-            </w:r>
-          </w:p>
-        </w:tc>
-        <w:tc>
-          <w:tcPr>
-            <w:tcW w:type="dxa" w:w="1505"/>
-          </w:tcPr>
-          <w:p>
-            <w:pPr>
-              <w:pStyle w:val="Compact"/>
-              <w:spacing w:line="240" w:lineRule="auto" w:after="40"/>
-              <w:jc w:val="right"/>
-            </w:pPr>
-            <w:r>
-              <w:rPr>
-                <w:sz w:val="19"/>
-              </w:rPr>
-              <w:t xml:space="preserve">0</w:t>
-            </w:r>
-          </w:p>
-        </w:tc>
-      </w:tr>
-      <w:tr>
-        <w:tc>
-          <w:tcPr>
-            <w:tcW w:type="dxa" w:w="6430"/>
-          </w:tcPr>
-          <w:p>
-            <w:pPr>
-              <w:pStyle w:val="Compact"/>
-              <w:spacing w:line="240" w:lineRule="auto" w:after="40"/>
-              <w:jc w:val="left"/>
-            </w:pPr>
-            <w:r>
-              <w:rPr>
-                <w:bCs/>
-                <w:b/>
-                <w:sz w:val="19"/>
-              </w:rPr>
-              <w:t xml:space="preserve">Total</w:t>
-            </w:r>
-          </w:p>
-        </w:tc>
-        <w:tc>
-          <w:tcPr>
-            <w:tcW w:type="dxa" w:w="1094"/>
-          </w:tcPr>
-          <w:p>
-            <w:pPr>
-              <w:pStyle w:val="Compact"/>
-              <w:spacing w:line="240" w:lineRule="auto" w:after="40"/>
-              <w:jc w:val="right"/>
-            </w:pPr>
-            <w:r>
-              <w:rPr>
-                <w:bCs/>
-                <w:b/>
-                <w:sz w:val="19"/>
-              </w:rPr>
-              <w:t xml:space="preserve">about 22</w:t>
-            </w:r>
-          </w:p>
-        </w:tc>
-        <w:tc>
-          <w:tcPr>
-            <w:tcW w:type="dxa" w:w="1505"/>
-          </w:tcPr>
-          <w:p>
-            <w:pPr>
-              <w:pStyle w:val="Compact"/>
-              <w:spacing w:line="240" w:lineRule="auto" w:after="40"/>
-              <w:jc w:val="right"/>
-            </w:pPr>
-            <w:r>
-              <w:rPr>
-                <w:bCs/>
-                <w:b/>
-                <w:sz w:val="19"/>
-              </w:rPr>
-              <w:t xml:space="preserve">about 2,640</w:t>
-            </w:r>
-          </w:p>
-        </w:tc>
-      </w:tr>
-    </w:tbl>
-    <w:p>
-      <w:pPr>
-        <w:pStyle w:val="BodyText"/>
-      </w:pPr>
-      <w:r>
-        <w:rPr>
-          <w:bCs/>
-          <w:b/>
-        </w:rPr>
-        <w:t xml:space="preserve">Alternate budget: buy instead of rent.</w:t>
-      </w:r>
-      <w:r>
-        <w:t xml:space="preserve"> </w:t>
-      </w:r>
-      <w:r>
-        <w:t xml:space="preserve">An RTX 4090 (24 GB) graphics card alone costs about BDT 2.4–2.9 lakh at Bangladeshi retailers, so a complete workstation would cost about BDT 4–5 lakh. It would run the study in 20–30 hours but pays off only after hundreds of runs. Renting cost less than 1% of buying and provided a larger 48 GB GPU, so renting was the right choice for a one-off study; buying makes sense only for a centre with continuous use.</w:t>
-      </w:r>
-    </w:p>
-    <w:p>
-      <w:pPr>
-        <w:pStyle w:val="BodyText"/>
-      </w:pPr>
-      <w:r>
-        <w:rPr>
-          <w:bCs/>
-          <w:b/>
-        </w:rPr>
-        <w:t xml:space="preserve">Revenue model (illustrative).</w:t>
-      </w:r>
-      <w:r>
-        <w:t xml:space="preserve"> </w:t>
-      </w:r>
-      <w:r>
-        <w:t xml:space="preserve">For a commercial version, assume 18 months of validation and registration and customers among diagnostic centres and hospitals with DTS-capable radiography (Tables 5.6 and 5.7).</w:t>
-      </w:r>
-    </w:p>
-    <w:p>
-      <w:pPr>
-        <w:pStyle w:val="BodyText"/>
-        <w:jc w:val="center"/>
-      </w:pPr>
-      <w:r>
-        <w:rPr>
-          <w:bCs/>
-          <w:b/>
-          <w:iCs/>
-          <w:i/>
-          <w:sz w:val="20"/>
-        </w:rPr>
-        <w:t xml:space="preserve">Table 5.6:</w:t>
       </w:r>
       <w:r>
         <w:rPr>
@@ -31836,7 +31297,7 @@
           <w:i/>
           <w:sz w:val="20"/>
         </w:rPr>
-        <w:t xml:space="preserve">Table 5.7:</w:t>
+        <w:t xml:space="preserve">Table 5.6:</w:t>
       </w:r>
       <w:r>
         <w:rPr>
@@ -32644,7 +32105,7 @@
           <w:i/>
           <w:sz w:val="20"/>
         </w:rPr>
-        <w:t xml:space="preserve">Table 5.8:</w:t>
+        <w:t xml:space="preserve">Table 5.7:</w:t>
       </w:r>
       <w:r>
         <w:rPr>
@@ -32968,7 +32429,7 @@
         <w:t xml:space="preserve"> </w:t>
       </w:r>
       <w:r>
-        <w:t xml:space="preserve">The solution requires X-ray projection physics, linear algebra of range and null spaces, probabilistic diffusion models, conformal statistics and 3D deep learning, beyond the standard curriculum. Table 5.9 maps the knowledge profiles.</w:t>
+        <w:t xml:space="preserve">The solution requires X-ray projection physics, linear algebra of range and null spaces, probabilistic diffusion models, conformal statistics and 3D deep learning, beyond the standard curriculum. Table 5.8 maps the knowledge profiles.</w:t>
       </w:r>
     </w:p>
     <w:p>
@@ -32984,7 +32445,7 @@
           <w:i/>
           <w:sz w:val="20"/>
         </w:rPr>
-        <w:t xml:space="preserve">Table 5.9:</w:t>
+        <w:t xml:space="preserve">Table 5.8:</w:t>
       </w:r>
       <w:r>
         <w:rPr>
@@ -33498,7 +32959,7 @@
           <w:i/>
           <w:sz w:val="20"/>
         </w:rPr>
-        <w:t xml:space="preserve">Table 5.10:</w:t>
+        <w:t xml:space="preserve">Table 5.9:</w:t>
       </w:r>
       <w:r>
         <w:rPr>
@@ -33744,7 +33205,7 @@
         <w:t xml:space="preserve"> </w:t>
       </w:r>
       <w:r>
-        <w:t xml:space="preserve">A public archive of 583 patients (about 64 GB), rented CPU and GPU machines with shared storage, free Kaggle GPUs and open-source libraries, all within about US$22.</w:t>
+        <w:t xml:space="preserve">A public archive of 583 patients (about 64 GB), rented CPU and GPU machines with shared storage, free Kaggle GPUs and open-source libraries.</w:t>
       </w:r>
     </w:p>
     <w:p>
@@ -33835,7 +33296,7 @@
         <w:pStyle w:val="FirstParagraph"/>
       </w:pPr>
       <w:r>
-        <w:t xml:space="preserve">MedLift-3D follows the software, hardware and communication standards relevant to medical imaging software and prepares for IEC 62304 and ISO 14971. Its main impacts are positive (lower dose and cost, wider access), with clear risks (wrong measurements, over-trust, untested populations) that the design mitigates through calibrated intervals, flags, clinician control and a validation plan. The project cost about US$22 and meets the attributes of a complex engineering problem.</w:t>
+        <w:t xml:space="preserve">MedLift-3D follows the software, hardware and communication standards relevant to medical imaging software and prepares for IEC 62304 and ISO 14971. Its main impacts are positive (lower dose and cost, wider access), with clear risks (wrong measurements, over-trust, untested populations) that the design mitigates through calibrated intervals, flags, clinician control and a validation plan. It meets the attributes of a complex engineering problem.</w:t>
       </w:r>
     </w:p>
     <w:bookmarkEnd w:id="212"/>
@@ -33871,7 +33332,7 @@
         <w:pStyle w:val="FirstParagraph"/>
       </w:pPr>
       <w:r>
-        <w:t xml:space="preserve">MedLift-3D turns one click on a low-dose chest tomosynthesis image into a 3D nodule measurement with calibrated uncertainty. We showed from projection moments that DTS measures a nodule’s mass in every view but its depth extent about 15 times worse, and built the system around that fact: a prism reconstruction around the click, a 17.4-million-parameter conditional diffusion prior kept consistent with the X-rays, 3D Gaussians that give mass in closed form, conformal intervals and calibrated size-category probabilities, a learned detector to suggest clicks, and a seen/unseen explanation of every result. A verified 18-step pipeline ran a 583-patient virtual clinical trial on LIDC-IDRI in 15 hours for about US$20. The components worked as specified: the prior improved nodule-region PSNR from 11.88 to 15.23 dB on held-out data, the detector reached a CPM of 0.298 against 0.017 for a training-free baseline, conformal intervals reached their target coverage, calibrated probabilities lowered the Brier score for</w:t>
+        <w:t xml:space="preserve">MedLift-3D turns one click on a low-dose chest tomosynthesis image into a 3D nodule measurement with calibrated uncertainty. We showed from projection moments that DTS measures a nodule’s mass in every view but its depth extent about 15 times worse, and built the system around that fact: a prism reconstruction around the click, a 17.4-million-parameter conditional diffusion prior kept consistent with the X-rays, 3D Gaussians that give mass in closed form, conformal intervals and calibrated size-category probabilities, a learned detector to suggest clicks, and a seen/unseen explanation of every result. A verified 18-step pipeline ran a 583-patient virtual clinical trial on LIDC-IDRI. The components worked as specified: the prior improved nodule-region PSNR from 11.88 to 15.23 dB on held-out data, the detector reached a CPM of 0.298 against 0.017 for a training-free baseline, conformal intervals reached their target coverage, calibrated probabilities lowered the Brier score for</w:t>
       </w:r>
       <w:r>
         <w:t xml:space="preserve"> </w:t>
@@ -34129,7 +33590,7 @@
         <w:t xml:space="preserve"> </w:t>
       </w:r>
       <w:r>
-        <w:t xml:space="preserve">The prior trained for 6 hours and was still improving, and its samples were better for training patients than for new ones (+7.00 vs +4.22 dB); the detector also partly memorised its training patients.</w:t>
+        <w:t xml:space="preserve">The prior was still improving when training stopped, and its samples were better for training patients than for new ones (+7.00 vs +4.22 dB); the detector also partly memorised its training patients.</w:t>
       </w:r>
     </w:p>
     <w:p>
@@ -34480,7 +33941,7 @@
         <w:pStyle w:val="FirstParagraph"/>
       </w:pPr>
       <w:r>
-        <w:t xml:space="preserve">Outside the classroom we learned to run a 15-hour unattended job on rented cloud machines (CPU and GPU pods sharing a network volume, terminal multiplexing, resumable scripts and backups), to download and organise 64 GB of medical images from TCIA, to read radiologist annotations with pylidc, and to serve a GPU application from a Kaggle notebook through an HTTPS tunnel when the usual share link failed.</w:t>
+        <w:t xml:space="preserve">Outside the classroom we learned to run a long unattended job on rented cloud machines (CPU and GPU pods sharing a network volume, terminal multiplexing, resumable scripts and backups), to download and organise 64 GB of medical images from TCIA, to read radiologist annotations with pylidc, and to serve a GPU application from a Kaggle notebook through an HTTPS tunnel when the usual share link failed.</w:t>
       </w:r>
     </w:p>
     <w:bookmarkEnd w:id="219"/>

</xml_diff>

<commit_message>
Report: fix duplicate tab:risk label
The EUPS category-probability table in chapter 4 and the hazard table in
chapter 5 shared a label, so chapter 4 cross-referenced Table 5.4. Rename
the chapter 4 label to tab:catprob; rebuild PDF and DOCX.

Co-Authored-By: Claude Opus 5.5 <noreply@anthropic.com>
Claude-Session: https://claude.ai/code/session_01HBr9Z21HqQzxE1eaHUCYUM
</commit_message>
<xml_diff>
--- a/report/MedLift3D_Report.docx
+++ b/report/MedLift3D_Report.docx
@@ -22770,7 +22770,7 @@
           <w:i/>
           <w:sz w:val="20"/>
         </w:rPr>
-        <w:t xml:space="preserve">Table 5.4:</w:t>
+        <w:t xml:space="preserve">Table 4.8:</w:t>
       </w:r>
       <w:r>
         <w:rPr>
@@ -23659,7 +23659,7 @@
         </m:sSup>
       </m:oMath>
       <w:r>
-        <w:t xml:space="preserve">: the Brier score fell from 0.543 (raw vote) to 0.174 and the ECE from 0.583 to 0.115 (Tables 5.4 and 4.14), and the most likely category was right for 38% of nodules instead of 26%. For the 300 mm</w:t>
+        <w:t xml:space="preserve">: the Brier score fell from 0.543 (raw vote) to 0.174 and the ECE from 0.583 to 0.115 (Tables 4.8 and 4.14), and the most likely category was right for 38% of nodules instead of 26%. For the 300 mm</w:t>
       </w:r>
       <m:oMath>
         <m:sSup>

</xml_diff>

<commit_message>
Report: add interval, predictive-distribution and second seen/unseen figures
Fig 4.13 draws the 90% volume intervals of all 74 test nodules from
step 16's uq_test_nodules.csv (70/74 covered, 61 upper bounds above
1e5 mm3, 16 failed reads). Fig 4.16 is step 16's calibrated predictive
distributions of four nodules; Fig 4.20 is step 17's seen/unseen split of
an 11.6 mm nodule where the prior recovers depth and the Gaussian fit
fails. Text references added; PDF and DOCX rebuilt.

Co-Authored-By: Claude Opus 5.5 <noreply@anthropic.com>
Claude-Session: https://claude.ai/code/session_01HBr9Z21HqQzxE1eaHUCYUM
</commit_message>
<xml_diff>
--- a/report/MedLift3D_Report.docx
+++ b/report/MedLift3D_Report.docx
@@ -14933,7 +14933,7 @@
     </w:p>
     <w:bookmarkEnd w:id="97"/>
     <w:bookmarkEnd w:id="98"/>
-    <w:bookmarkStart w:id="193" w:name="chapter-4-implementation-and-results"/>
+    <w:bookmarkStart w:id="202" w:name="chapter-4-implementation-and-results"/>
     <w:p>
       <w:pPr>
         <w:pStyle w:val="Heading1"/>
@@ -19194,7 +19194,7 @@
     </w:p>
     <w:bookmarkEnd w:id="123"/>
     <w:bookmarkEnd w:id="124"/>
-    <w:bookmarkStart w:id="191" w:name="results-and-discussion"/>
+    <w:bookmarkStart w:id="200" w:name="results-and-discussion"/>
     <w:p>
       <w:pPr>
         <w:pStyle w:val="Heading2"/>
@@ -21827,7 +21827,7 @@
       </w:r>
     </w:p>
     <w:bookmarkEnd w:id="148"/>
-    <w:bookmarkStart w:id="158" w:name="calibrated-uncertainty-h3-h5"/>
+    <w:bookmarkStart w:id="164" w:name="calibrated-uncertainty-h3-h5"/>
     <w:p>
       <w:pPr>
         <w:pStyle w:val="Heading3"/>
@@ -21841,7 +21841,7 @@
         <w:pStyle w:val="FirstParagraph"/>
       </w:pPr>
       <w:r>
-        <w:t xml:space="preserve">Table 4.7 gives the conformal intervals of the full method. All variants calibrated on the 76 calibration nodules reach or exceed the 90% target coverage on the test nodules except the Mondrian variant for volume, so the coverage guarantee of conformal prediction held in practice (Figure 4.13). The raw ensemble spread, used as</w:t>
+        <w:t xml:space="preserve">Table 4.7 gives the conformal intervals of the full method. All variants calibrated on the 76 calibration nodules reach or exceed the 90% target coverage on the test nodules except the Mondrian variant for volume, so the coverage guarantee of conformal prediction held in practice (Figure 4.14). The raw ensemble spread, used as</w:t>
       </w:r>
       <w:r>
         <w:t xml:space="preserve"> </w:t>
@@ -21877,7 +21877,44 @@
         <w:t xml:space="preserve"> </w:t>
       </w:r>
       <w:r>
-        <w:t xml:space="preserve">Their median width is many orders of magnitude larger than the estimate, and the normalised variants are effectively unbounded. The reason is the failures: a measurement of zero gives an infinite log-error, so with 22–26% failures among the calibration nodules the conformal quantile lands on infinite scores. The Mondrian variant is the only one with finite widths, at about 58 times the estimate. H3 is therefore supported for validity (coverage) but not for usefulness (width), and its sub-claim that mass intervals are narrower than volume intervals cannot be assessed with unbounded widths.</w:t>
+        <w:t xml:space="preserve">Their median width is many orders of magnitude larger than the estimate, and the normalised variants are effectively unbounded. The reason is the failures: a measurement of zero gives an infinite log-error, so with 22–26% failures among the calibration nodules the conformal quantile lands on infinite scores. The Mondrian variant is the only one with finite widths, at about 58 times the estimate. H3 is therefore supported for validity (coverage) but not for usefulness (width), and its sub-claim that mass intervals are narrower than volume intervals cannot be assessed with unbounded widths. Figure 4.13 shows both findings for every test nodule: the truth falls inside 70 of the 74 intervals, but 61 upper bounds lie above</w:t>
+      </w:r>
+      <w:r>
+        <w:t xml:space="preserve"> </w:t>
+      </w:r>
+      <m:oMath>
+        <m:sSup>
+          <m:e>
+            <m:r>
+              <m:t>10</m:t>
+            </m:r>
+          </m:e>
+          <m:sup>
+            <m:r>
+              <m:t>5</m:t>
+            </m:r>
+          </m:sup>
+        </m:sSup>
+      </m:oMath>
+      <w:r>
+        <w:t xml:space="preserve"> mm</w:t>
+      </w:r>
+      <m:oMath>
+        <m:sSup>
+          <m:e>
+            <m:r>
+              <m:t>​</m:t>
+            </m:r>
+          </m:e>
+          <m:sup>
+            <m:r>
+              <m:t>3</m:t>
+            </m:r>
+          </m:sup>
+        </m:sSup>
+      </m:oMath>
+      <w:r>
+        <w:t xml:space="preserve">, and the 16 failed reads (estimate zero) sit at the bottom of their intervals.</w:t>
       </w:r>
     </w:p>
     <w:p>
@@ -22763,6 +22800,86 @@
         <w:jc w:val="center"/>
       </w:pPr>
       <w:r>
+        <w:drawing>
+          <wp:inline>
+            <wp:extent cx="5334000" cy="2453640"/>
+            <wp:effectExtent b="0" l="0" r="0" t="0"/>
+            <wp:docPr descr="image" title="" id="150" name="Picture"/>
+            <a:graphic>
+              <a:graphicData uri="http://schemas.openxmlformats.org/drawingml/2006/picture">
+                <pic:pic>
+                  <pic:nvPicPr>
+                    <pic:cNvPr descr="/home/user/medlift3d/report/figures/results/interval_overview.png" id="151" name="Picture"/>
+                    <pic:cNvPicPr>
+                      <a:picLocks noChangeArrowheads="1" noChangeAspect="1"/>
+                    </pic:cNvPicPr>
+                  </pic:nvPicPr>
+                  <pic:blipFill>
+                    <a:blip r:embed="rId149"/>
+                    <a:stretch>
+                      <a:fillRect/>
+                    </a:stretch>
+                  </pic:blipFill>
+                  <pic:spPr bwMode="auto">
+                    <a:xfrm>
+                      <a:off x="0" y="0"/>
+                      <a:ext cx="5334000" cy="2453640"/>
+                    </a:xfrm>
+                    <a:prstGeom prst="rect">
+                      <a:avLst/>
+                    </a:prstGeom>
+                    <a:noFill/>
+                    <a:ln w="9525">
+                      <a:noFill/>
+                      <a:headEnd/>
+                      <a:tailEnd/>
+                    </a:ln>
+                  </pic:spPr>
+                </pic:pic>
+              </a:graphicData>
+            </a:graphic>
+          </wp:inline>
+        </w:drawing>
+      </w:r>
+    </w:p>
+    <w:p>
+      <w:pPr>
+        <w:pStyle w:val="BodyText"/>
+        <w:jc w:val="center"/>
+      </w:pPr>
+      <w:r>
+        <w:rPr>
+          <w:bCs/>
+          <w:b/>
+          <w:iCs/>
+          <w:i/>
+          <w:sz w:val="20"/>
+        </w:rPr>
+        <w:t xml:space="preserve">Figure 4.13:</w:t>
+      </w:r>
+      <w:r>
+        <w:rPr>
+          <w:iCs/>
+          <w:i/>
+          <w:sz w:val="20"/>
+        </w:rPr>
+        <w:t xml:space="preserve"> </w:t>
+      </w:r>
+      <w:r>
+        <w:rPr>
+          <w:iCs/>
+          <w:i/>
+          <w:sz w:val="20"/>
+        </w:rPr>
+        <w:t xml:space="preserve">Conformal 90% volume intervals (normalised by the ensemble spread) for the 74 test nodules, sorted by the radiologists’ consensus volume. Green: truth inside the interval; red: outside; cross: failed read with estimate zero; arrow: upper bound beyond the plotted range.</w:t>
+      </w:r>
+    </w:p>
+    <w:p>
+      <w:pPr>
+        <w:pStyle w:val="BodyText"/>
+        <w:jc w:val="center"/>
+      </w:pPr>
+      <w:r>
         <w:rPr>
           <w:bCs/>
           <w:b/>
@@ -23632,221 +23749,37 @@
         <w:pStyle w:val="BodyText"/>
       </w:pPr>
       <w:r>
-        <w:rPr>
-          <w:bCs/>
-          <w:b/>
-        </w:rPr>
-        <w:t xml:space="preserve">H5 is partly supported.</w:t>
-      </w:r>
-      <w:r>
-        <w:t xml:space="preserve"> </w:t>
-      </w:r>
-      <w:r>
-        <w:t xml:space="preserve">Calibration clearly helped the probability that a nodule is at least 100 mm</w:t>
+        <w:t xml:space="preserve">The category probabilities are read off each nodule’s calibrated predictive distribution, the probability that its volume is at most</w:t>
+      </w:r>
+      <w:r>
+        <w:t xml:space="preserve"> </w:t>
       </w:r>
       <m:oMath>
-        <m:sSup>
-          <m:e>
-            <m:r>
-              <m:t>​</m:t>
-            </m:r>
-          </m:e>
-          <m:sup>
-            <m:r>
-              <m:t>3</m:t>
-            </m:r>
-          </m:sup>
-        </m:sSup>
+        <m:r>
+          <m:t>v</m:t>
+        </m:r>
       </m:oMath>
       <w:r>
-        <w:t xml:space="preserve">: the Brier score fell from 0.543 (raw vote) to 0.174 and the ECE from 0.583 to 0.115 (Tables 4.8 and 4.14), and the most likely category was right for 38% of nodules instead of 26%. For the 300 mm</w:t>
+        <w:t xml:space="preserve"> </w:t>
+      </w:r>
+      <w:r>
+        <w:t xml:space="preserve">for every</w:t>
+      </w:r>
+      <w:r>
+        <w:t xml:space="preserve"> </w:t>
       </w:r>
       <m:oMath>
-        <m:sSup>
-          <m:e>
-            <m:r>
-              <m:t>​</m:t>
-            </m:r>
-          </m:e>
-          <m:sup>
-            <m:r>
-              <m:t>3</m:t>
-            </m:r>
-          </m:sup>
-        </m:sSup>
+        <m:r>
+          <m:t>v</m:t>
+        </m:r>
       </m:oMath>
       <w:r>
         <w:t xml:space="preserve"> </w:t>
       </w:r>
       <w:r>
-        <w:t xml:space="preserve">threshold calibration made almost no difference (0.284 vs 0.291). The category sets from the 90% intervals contained the true category for 99% of nodules but held 2.91 of the 3 categories on average, again valid but uninformative. Mondrian calibration raised the worst size-group coverage for mass from 89% to 96% but not for volume (82% to 79%; Figure 4.15), so size-conditional coverage was achieved for mass only.</w:t>
-      </w:r>
-    </w:p>
-    <w:p>
-      <w:pPr>
-        <w:pStyle w:val="BodyText"/>
-        <w:jc w:val="center"/>
-      </w:pPr>
-      <w:r>
-        <w:drawing>
-          <wp:inline>
-            <wp:extent cx="4791739" cy="3870251"/>
-            <wp:effectExtent b="0" l="0" r="0" t="0"/>
-            <wp:docPr descr="image" title="" id="150" name="Picture"/>
-            <a:graphic>
-              <a:graphicData uri="http://schemas.openxmlformats.org/drawingml/2006/picture">
-                <pic:pic>
-                  <pic:nvPicPr>
-                    <pic:cNvPr descr="/home/user/medlift3d/report/figures/results/volume_coverage_levels.png" id="151" name="Picture"/>
-                    <pic:cNvPicPr>
-                      <a:picLocks noChangeArrowheads="1" noChangeAspect="1"/>
-                    </pic:cNvPicPr>
-                  </pic:nvPicPr>
-                  <pic:blipFill>
-                    <a:blip r:embed="rId149"/>
-                    <a:stretch>
-                      <a:fillRect/>
-                    </a:stretch>
-                  </pic:blipFill>
-                  <pic:spPr bwMode="auto">
-                    <a:xfrm>
-                      <a:off x="0" y="0"/>
-                      <a:ext cx="4791739" cy="3870251"/>
-                    </a:xfrm>
-                    <a:prstGeom prst="rect">
-                      <a:avLst/>
-                    </a:prstGeom>
-                    <a:noFill/>
-                    <a:ln w="9525">
-                      <a:noFill/>
-                      <a:headEnd/>
-                      <a:tailEnd/>
-                    </a:ln>
-                  </pic:spPr>
-                </pic:pic>
-              </a:graphicData>
-            </a:graphic>
-          </wp:inline>
-        </w:drawing>
-      </w:r>
-    </w:p>
-    <w:p>
-      <w:pPr>
-        <w:pStyle w:val="BodyText"/>
-        <w:jc w:val="center"/>
-      </w:pPr>
-      <w:r>
-        <w:rPr>
-          <w:bCs/>
-          <w:b/>
-          <w:iCs/>
-          <w:i/>
-          <w:sz w:val="20"/>
-        </w:rPr>
-        <w:t xml:space="preserve">Figure 4.13:</w:t>
-      </w:r>
-      <w:r>
-        <w:rPr>
-          <w:iCs/>
-          <w:i/>
-          <w:sz w:val="20"/>
-        </w:rPr>
-        <w:t xml:space="preserve"> </w:t>
-      </w:r>
-      <w:r>
-        <w:rPr>
-          <w:iCs/>
-          <w:i/>
-          <w:sz w:val="20"/>
-        </w:rPr>
-        <w:t xml:space="preserve">Observed coverage at every nominal level for the volume intervals (test nodules): conformal intervals lie on or above the diagonal, the raw ensemble spread far below it.</w:t>
-      </w:r>
-    </w:p>
-    <w:p>
-      <w:pPr>
-        <w:pStyle w:val="BodyText"/>
-        <w:jc w:val="center"/>
-      </w:pPr>
-      <w:r>
-        <w:drawing>
-          <wp:inline>
-            <wp:extent cx="5334000" cy="2346960"/>
-            <wp:effectExtent b="0" l="0" r="0" t="0"/>
-            <wp:docPr descr="image" title="" id="153" name="Picture"/>
-            <a:graphic>
-              <a:graphicData uri="http://schemas.openxmlformats.org/drawingml/2006/picture">
-                <pic:pic>
-                  <pic:nvPicPr>
-                    <pic:cNvPr descr="/home/user/medlift3d/report/figures/results/reliability.png" id="154" name="Picture"/>
-                    <pic:cNvPicPr>
-                      <a:picLocks noChangeArrowheads="1" noChangeAspect="1"/>
-                    </pic:cNvPicPr>
-                  </pic:nvPicPr>
-                  <pic:blipFill>
-                    <a:blip r:embed="rId152"/>
-                    <a:stretch>
-                      <a:fillRect/>
-                    </a:stretch>
-                  </pic:blipFill>
-                  <pic:spPr bwMode="auto">
-                    <a:xfrm>
-                      <a:off x="0" y="0"/>
-                      <a:ext cx="5334000" cy="2346960"/>
-                    </a:xfrm>
-                    <a:prstGeom prst="rect">
-                      <a:avLst/>
-                    </a:prstGeom>
-                    <a:noFill/>
-                    <a:ln w="9525">
-                      <a:noFill/>
-                      <a:headEnd/>
-                      <a:tailEnd/>
-                    </a:ln>
-                  </pic:spPr>
-                </pic:pic>
-              </a:graphicData>
-            </a:graphic>
-          </wp:inline>
-        </w:drawing>
-      </w:r>
-    </w:p>
-    <w:p>
-      <w:pPr>
-        <w:pStyle w:val="BodyText"/>
-        <w:jc w:val="center"/>
-      </w:pPr>
-      <w:r>
-        <w:rPr>
-          <w:bCs/>
-          <w:b/>
-          <w:iCs/>
-          <w:i/>
-          <w:sz w:val="20"/>
-        </w:rPr>
-        <w:t xml:space="preserve">Figure 4.14:</w:t>
-      </w:r>
-      <w:r>
-        <w:rPr>
-          <w:iCs/>
-          <w:i/>
-          <w:sz w:val="20"/>
-        </w:rPr>
-        <w:t xml:space="preserve"> </w:t>
-      </w:r>
-      <w:r>
-        <w:rPr>
-          <w:iCs/>
-          <w:i/>
-          <w:sz w:val="20"/>
-        </w:rPr>
-        <w:t xml:space="preserve">Reliability diagrams of the EUPS category probabilities for</w:t>
-      </w:r>
-      <w:r>
-        <w:rPr>
-          <w:iCs/>
-          <w:i/>
-          <w:sz w:val="20"/>
-        </w:rPr>
+        <w:t xml:space="preserve">(Figure 4.16):</w:t>
+      </w:r>
+      <w:r>
         <w:t xml:space="preserve"> </w:t>
       </w:r>
       <m:oMath>
@@ -23877,6 +23810,277 @@
         </m:d>
       </m:oMath>
       <w:r>
+        <w:t xml:space="preserve"> </w:t>
+      </w:r>
+      <w:r>
+        <w:t xml:space="preserve">is one minus its value at 100 mm</w:t>
+      </w:r>
+      <m:oMath>
+        <m:sSup>
+          <m:e>
+            <m:r>
+              <m:t>​</m:t>
+            </m:r>
+          </m:e>
+          <m:sup>
+            <m:r>
+              <m:t>3</m:t>
+            </m:r>
+          </m:sup>
+        </m:sSup>
+      </m:oMath>
+      <w:r>
+        <w:t xml:space="preserve">.</w:t>
+      </w:r>
+      <w:r>
+        <w:t xml:space="preserve"> </w:t>
+      </w:r>
+      <w:r>
+        <w:rPr>
+          <w:bCs/>
+          <w:b/>
+        </w:rPr>
+        <w:t xml:space="preserve">H5 is partly supported.</w:t>
+      </w:r>
+      <w:r>
+        <w:t xml:space="preserve"> </w:t>
+      </w:r>
+      <w:r>
+        <w:t xml:space="preserve">Calibration clearly helped the probability that a nodule is at least 100 mm</w:t>
+      </w:r>
+      <m:oMath>
+        <m:sSup>
+          <m:e>
+            <m:r>
+              <m:t>​</m:t>
+            </m:r>
+          </m:e>
+          <m:sup>
+            <m:r>
+              <m:t>3</m:t>
+            </m:r>
+          </m:sup>
+        </m:sSup>
+      </m:oMath>
+      <w:r>
+        <w:t xml:space="preserve">: the Brier score fell from 0.543 (raw vote) to 0.174 and the ECE from 0.583 to 0.115 (Tables 4.8 and 4.15), and the most likely category was right for 38% of nodules instead of 26%. For the 300 mm</w:t>
+      </w:r>
+      <m:oMath>
+        <m:sSup>
+          <m:e>
+            <m:r>
+              <m:t>​</m:t>
+            </m:r>
+          </m:e>
+          <m:sup>
+            <m:r>
+              <m:t>3</m:t>
+            </m:r>
+          </m:sup>
+        </m:sSup>
+      </m:oMath>
+      <w:r>
+        <w:t xml:space="preserve"> </w:t>
+      </w:r>
+      <w:r>
+        <w:t xml:space="preserve">threshold calibration made almost no difference (0.284 vs 0.291). The category sets from the 90% intervals contained the true category for 99% of nodules but held 2.91 of the 3 categories on average, again valid but uninformative. Mondrian calibration raised the worst size-group coverage for mass from 89% to 96% but not for volume (82% to 79%; Figure 4.17), so size-conditional coverage was achieved for mass only.</w:t>
+      </w:r>
+    </w:p>
+    <w:p>
+      <w:pPr>
+        <w:pStyle w:val="BodyText"/>
+        <w:jc w:val="center"/>
+      </w:pPr>
+      <w:r>
+        <w:drawing>
+          <wp:inline>
+            <wp:extent cx="4791739" cy="3870251"/>
+            <wp:effectExtent b="0" l="0" r="0" t="0"/>
+            <wp:docPr descr="image" title="" id="153" name="Picture"/>
+            <a:graphic>
+              <a:graphicData uri="http://schemas.openxmlformats.org/drawingml/2006/picture">
+                <pic:pic>
+                  <pic:nvPicPr>
+                    <pic:cNvPr descr="/home/user/medlift3d/report/figures/results/volume_coverage_levels.png" id="154" name="Picture"/>
+                    <pic:cNvPicPr>
+                      <a:picLocks noChangeArrowheads="1" noChangeAspect="1"/>
+                    </pic:cNvPicPr>
+                  </pic:nvPicPr>
+                  <pic:blipFill>
+                    <a:blip r:embed="rId152"/>
+                    <a:stretch>
+                      <a:fillRect/>
+                    </a:stretch>
+                  </pic:blipFill>
+                  <pic:spPr bwMode="auto">
+                    <a:xfrm>
+                      <a:off x="0" y="0"/>
+                      <a:ext cx="4791739" cy="3870251"/>
+                    </a:xfrm>
+                    <a:prstGeom prst="rect">
+                      <a:avLst/>
+                    </a:prstGeom>
+                    <a:noFill/>
+                    <a:ln w="9525">
+                      <a:noFill/>
+                      <a:headEnd/>
+                      <a:tailEnd/>
+                    </a:ln>
+                  </pic:spPr>
+                </pic:pic>
+              </a:graphicData>
+            </a:graphic>
+          </wp:inline>
+        </w:drawing>
+      </w:r>
+    </w:p>
+    <w:p>
+      <w:pPr>
+        <w:pStyle w:val="BodyText"/>
+        <w:jc w:val="center"/>
+      </w:pPr>
+      <w:r>
+        <w:rPr>
+          <w:bCs/>
+          <w:b/>
+          <w:iCs/>
+          <w:i/>
+          <w:sz w:val="20"/>
+        </w:rPr>
+        <w:t xml:space="preserve">Figure 4.14:</w:t>
+      </w:r>
+      <w:r>
+        <w:rPr>
+          <w:iCs/>
+          <w:i/>
+          <w:sz w:val="20"/>
+        </w:rPr>
+        <w:t xml:space="preserve"> </w:t>
+      </w:r>
+      <w:r>
+        <w:rPr>
+          <w:iCs/>
+          <w:i/>
+          <w:sz w:val="20"/>
+        </w:rPr>
+        <w:t xml:space="preserve">Observed coverage at every nominal level for the volume intervals (test nodules): conformal intervals lie on or above the diagonal, the raw ensemble spread far below it.</w:t>
+      </w:r>
+    </w:p>
+    <w:p>
+      <w:pPr>
+        <w:pStyle w:val="BodyText"/>
+        <w:jc w:val="center"/>
+      </w:pPr>
+      <w:r>
+        <w:drawing>
+          <wp:inline>
+            <wp:extent cx="5334000" cy="2346960"/>
+            <wp:effectExtent b="0" l="0" r="0" t="0"/>
+            <wp:docPr descr="image" title="" id="156" name="Picture"/>
+            <a:graphic>
+              <a:graphicData uri="http://schemas.openxmlformats.org/drawingml/2006/picture">
+                <pic:pic>
+                  <pic:nvPicPr>
+                    <pic:cNvPr descr="/home/user/medlift3d/report/figures/results/reliability.png" id="157" name="Picture"/>
+                    <pic:cNvPicPr>
+                      <a:picLocks noChangeArrowheads="1" noChangeAspect="1"/>
+                    </pic:cNvPicPr>
+                  </pic:nvPicPr>
+                  <pic:blipFill>
+                    <a:blip r:embed="rId155"/>
+                    <a:stretch>
+                      <a:fillRect/>
+                    </a:stretch>
+                  </pic:blipFill>
+                  <pic:spPr bwMode="auto">
+                    <a:xfrm>
+                      <a:off x="0" y="0"/>
+                      <a:ext cx="5334000" cy="2346960"/>
+                    </a:xfrm>
+                    <a:prstGeom prst="rect">
+                      <a:avLst/>
+                    </a:prstGeom>
+                    <a:noFill/>
+                    <a:ln w="9525">
+                      <a:noFill/>
+                      <a:headEnd/>
+                      <a:tailEnd/>
+                    </a:ln>
+                  </pic:spPr>
+                </pic:pic>
+              </a:graphicData>
+            </a:graphic>
+          </wp:inline>
+        </w:drawing>
+      </w:r>
+    </w:p>
+    <w:p>
+      <w:pPr>
+        <w:pStyle w:val="BodyText"/>
+        <w:jc w:val="center"/>
+      </w:pPr>
+      <w:r>
+        <w:rPr>
+          <w:bCs/>
+          <w:b/>
+          <w:iCs/>
+          <w:i/>
+          <w:sz w:val="20"/>
+        </w:rPr>
+        <w:t xml:space="preserve">Figure 4.15:</w:t>
+      </w:r>
+      <w:r>
+        <w:rPr>
+          <w:iCs/>
+          <w:i/>
+          <w:sz w:val="20"/>
+        </w:rPr>
+        <w:t xml:space="preserve"> </w:t>
+      </w:r>
+      <w:r>
+        <w:rPr>
+          <w:iCs/>
+          <w:i/>
+          <w:sz w:val="20"/>
+        </w:rPr>
+        <w:t xml:space="preserve">Reliability diagrams of the EUPS category probabilities for</w:t>
+      </w:r>
+      <w:r>
+        <w:rPr>
+          <w:iCs/>
+          <w:i/>
+          <w:sz w:val="20"/>
+        </w:rPr>
+        <w:t xml:space="preserve"> </w:t>
+      </w:r>
+      <m:oMath>
+        <m:r>
+          <m:t>P</m:t>
+        </m:r>
+        <m:d>
+          <m:dPr>
+            <m:begChr m:val="("/>
+            <m:endChr m:val=")"/>
+            <m:sepChr m:val=""/>
+            <m:grow/>
+          </m:dPr>
+          <m:e>
+            <m:r>
+              <m:t>V</m:t>
+            </m:r>
+            <m:r>
+              <m:rPr>
+                <m:sty m:val="p"/>
+              </m:rPr>
+              <m:t>≥</m:t>
+            </m:r>
+            <m:r>
+              <m:t>100</m:t>
+            </m:r>
+          </m:e>
+        </m:d>
+      </m:oMath>
+      <w:r>
         <w:rPr>
           <w:iCs/>
           <w:i/>
@@ -23952,20 +24156,159 @@
       <w:r>
         <w:drawing>
           <wp:inline>
-            <wp:extent cx="5334000" cy="2909454"/>
+            <wp:extent cx="5334000" cy="1259416"/>
             <wp:effectExtent b="0" l="0" r="0" t="0"/>
-            <wp:docPr descr="image" title="" id="156" name="Picture"/>
+            <wp:docPr descr="image" title="" id="159" name="Picture"/>
             <a:graphic>
               <a:graphicData uri="http://schemas.openxmlformats.org/drawingml/2006/picture">
                 <pic:pic>
                   <pic:nvPicPr>
-                    <pic:cNvPr descr="/home/user/medlift3d/report/figures/results/group_coverage.png" id="157" name="Picture"/>
+                    <pic:cNvPr descr="/home/user/medlift3d/report/figures/results/volume_cpd_examples.png" id="160" name="Picture"/>
                     <pic:cNvPicPr>
                       <a:picLocks noChangeArrowheads="1" noChangeAspect="1"/>
                     </pic:cNvPicPr>
                   </pic:nvPicPr>
                   <pic:blipFill>
-                    <a:blip r:embed="rId155"/>
+                    <a:blip r:embed="rId158"/>
+                    <a:stretch>
+                      <a:fillRect/>
+                    </a:stretch>
+                  </pic:blipFill>
+                  <pic:spPr bwMode="auto">
+                    <a:xfrm>
+                      <a:off x="0" y="0"/>
+                      <a:ext cx="5334000" cy="1259416"/>
+                    </a:xfrm>
+                    <a:prstGeom prst="rect">
+                      <a:avLst/>
+                    </a:prstGeom>
+                    <a:noFill/>
+                    <a:ln w="9525">
+                      <a:noFill/>
+                      <a:headEnd/>
+                      <a:tailEnd/>
+                    </a:ln>
+                  </pic:spPr>
+                </pic:pic>
+              </a:graphicData>
+            </a:graphic>
+          </wp:inline>
+        </w:drawing>
+      </w:r>
+    </w:p>
+    <w:p>
+      <w:pPr>
+        <w:pStyle w:val="BodyText"/>
+        <w:jc w:val="center"/>
+      </w:pPr>
+      <w:r>
+        <w:rPr>
+          <w:bCs/>
+          <w:b/>
+          <w:iCs/>
+          <w:i/>
+          <w:sz w:val="20"/>
+        </w:rPr>
+        <w:t xml:space="preserve">Figure 4.16:</w:t>
+      </w:r>
+      <w:r>
+        <w:rPr>
+          <w:iCs/>
+          <w:i/>
+          <w:sz w:val="20"/>
+        </w:rPr>
+        <w:t xml:space="preserve"> </w:t>
+      </w:r>
+      <w:r>
+        <w:rPr>
+          <w:iCs/>
+          <w:i/>
+          <w:sz w:val="20"/>
+        </w:rPr>
+        <w:t xml:space="preserve">Calibrated conformal predictive distributions of four test nodules: the probability that the volume is at most</w:t>
+      </w:r>
+      <w:r>
+        <w:rPr>
+          <w:iCs/>
+          <w:i/>
+          <w:sz w:val="20"/>
+        </w:rPr>
+        <w:t xml:space="preserve"> </w:t>
+      </w:r>
+      <m:oMath>
+        <m:r>
+          <m:t>v</m:t>
+        </m:r>
+      </m:oMath>
+      <w:r>
+        <w:rPr>
+          <w:iCs/>
+          <w:i/>
+          <w:sz w:val="20"/>
+        </w:rPr>
+        <w:t xml:space="preserve"> </w:t>
+      </w:r>
+      <w:r>
+        <w:rPr>
+          <w:iCs/>
+          <w:i/>
+          <w:sz w:val="20"/>
+        </w:rPr>
+        <w:t xml:space="preserve">(blue), the estimate (dotted), the truth (green) and the EUPS thresholds of 100 and 300 mm</w:t>
+      </w:r>
+      <m:oMath>
+        <m:sSup>
+          <m:e>
+            <m:r>
+              <m:t>​</m:t>
+            </m:r>
+          </m:e>
+          <m:sup>
+            <m:r>
+              <m:t>3</m:t>
+            </m:r>
+          </m:sup>
+        </m:sSup>
+      </m:oMath>
+      <w:r>
+        <w:rPr>
+          <w:iCs/>
+          <w:i/>
+          <w:sz w:val="20"/>
+        </w:rPr>
+        <w:t xml:space="preserve"> </w:t>
+      </w:r>
+      <w:r>
+        <w:rPr>
+          <w:iCs/>
+          <w:i/>
+          <w:sz w:val="20"/>
+        </w:rPr>
+        <w:t xml:space="preserve">(red). A steep curve near the truth is a confident, correct prediction; a shallow one spreads the probability over all categories.</w:t>
+      </w:r>
+    </w:p>
+    <w:p>
+      <w:pPr>
+        <w:pStyle w:val="BodyText"/>
+        <w:jc w:val="center"/>
+      </w:pPr>
+      <w:r>
+        <w:drawing>
+          <wp:inline>
+            <wp:extent cx="5334000" cy="2909454"/>
+            <wp:effectExtent b="0" l="0" r="0" t="0"/>
+            <wp:docPr descr="image" title="" id="162" name="Picture"/>
+            <a:graphic>
+              <a:graphicData uri="http://schemas.openxmlformats.org/drawingml/2006/picture">
+                <pic:pic>
+                  <pic:nvPicPr>
+                    <pic:cNvPr descr="/home/user/medlift3d/report/figures/results/group_coverage.png" id="163" name="Picture"/>
+                    <pic:cNvPicPr>
+                      <a:picLocks noChangeArrowheads="1" noChangeAspect="1"/>
+                    </pic:cNvPicPr>
+                  </pic:nvPicPr>
+                  <pic:blipFill>
+                    <a:blip r:embed="rId161"/>
                     <a:stretch>
                       <a:fillRect/>
                     </a:stretch>
@@ -24005,7 +24348,7 @@
           <w:i/>
           <w:sz w:val="20"/>
         </w:rPr>
-        <w:t xml:space="preserve">Figure 4.15:</w:t>
+        <w:t xml:space="preserve">Figure 4.17:</w:t>
       </w:r>
       <w:r>
         <w:rPr>
@@ -24024,8 +24367,8 @@
         <w:t xml:space="preserve">Coverage of the volume intervals in three size groups, with and without Mondrian calibration.</w:t>
       </w:r>
     </w:p>
-    <w:bookmarkEnd w:id="158"/>
-    <w:bookmarkStart w:id="162" w:name="growth-h4"/>
+    <w:bookmarkEnd w:id="164"/>
+    <w:bookmarkStart w:id="168" w:name="growth-h4"/>
     <w:p>
       <w:pPr>
         <w:pStyle w:val="Heading3"/>
@@ -25023,7 +25366,7 @@
         <w:t xml:space="preserve"> </w:t>
       </w:r>
       <w:r>
-        <w:t xml:space="preserve">units, no false growth alarms), and for the coarse SIRT the MDT error was much smaller than the VDT error (0.88 vs 2.14), in line with the mass-first argument; but these differences are small for 40 pairs. One verification check of this step failed: the mass added by the virtual growth deviated from its intended value by up to 7.5% (limit 3%), because the mass window also contains nearby vessels; the growth results are therefore indicative only. Figure 4.16 shows estimated against true doubling times.</w:t>
+        <w:t xml:space="preserve">units, no false growth alarms), and for the coarse SIRT the MDT error was much smaller than the VDT error (0.88 vs 2.14), in line with the mass-first argument; but these differences are small for 40 pairs. One verification check of this step failed: the mass added by the virtual growth deviated from its intended value by up to 7.5% (limit 3%), because the mass window also contains nearby vessels; the growth results are therefore indicative only. Figure 4.18 shows estimated against true doubling times.</w:t>
       </w:r>
     </w:p>
     <w:p>
@@ -25036,18 +25379,18 @@
           <wp:inline>
             <wp:extent cx="4073236" cy="3873730"/>
             <wp:effectExtent b="0" l="0" r="0" t="0"/>
-            <wp:docPr descr="image" title="" id="160" name="Picture"/>
+            <wp:docPr descr="image" title="" id="166" name="Picture"/>
             <a:graphic>
               <a:graphicData uri="http://schemas.openxmlformats.org/drawingml/2006/picture">
                 <pic:pic>
                   <pic:nvPicPr>
-                    <pic:cNvPr descr="/home/user/medlift3d/report/figures/results/doubling_time.png" id="161" name="Picture"/>
+                    <pic:cNvPr descr="/home/user/medlift3d/report/figures/results/doubling_time.png" id="167" name="Picture"/>
                     <pic:cNvPicPr>
                       <a:picLocks noChangeArrowheads="1" noChangeAspect="1"/>
                     </pic:cNvPicPr>
                   </pic:nvPicPr>
                   <pic:blipFill>
-                    <a:blip r:embed="rId159"/>
+                    <a:blip r:embed="rId165"/>
                     <a:stretch>
                       <a:fillRect/>
                     </a:stretch>
@@ -25087,7 +25430,7 @@
           <w:i/>
           <w:sz w:val="20"/>
         </w:rPr>
-        <w:t xml:space="preserve">Figure 4.16:</w:t>
+        <w:t xml:space="preserve">Figure 4.18:</w:t>
       </w:r>
       <w:r>
         <w:rPr>
@@ -25106,8 +25449,8 @@
         <w:t xml:space="preserve">Estimated vs true doubling time for diffusion with Gaussians (VDT and MDT).</w:t>
       </w:r>
     </w:p>
-    <w:bookmarkEnd w:id="162"/>
-    <w:bookmarkStart w:id="169" w:name="explainability-h6"/>
+    <w:bookmarkEnd w:id="168"/>
+    <w:bookmarkStart w:id="178" w:name="explainability-h6"/>
     <w:p>
       <w:pPr>
         <w:pStyle w:val="Heading3"/>
@@ -25851,7 +26194,24 @@
         </m:r>
       </m:oMath>
       <w:r>
-        <w:t xml:space="preserve">). Figure 4.17 shows one nodule.</w:t>
+        <w:t xml:space="preserve">). Figure 4.19 shows one nodule. Figure 4.20 shows an 11.6 mm nodule of the same patient where the prior works as intended and the Gaussian step then fails: the diffusion samples recover the hidden depth (unseen skill 0.36, seen skill 0.93), but the Gaussian fit returns no nodule at all (volume zero against 615 mm</w:t>
+      </w:r>
+      <m:oMath>
+        <m:sSup>
+          <m:e>
+            <m:r>
+              <m:t>​</m:t>
+            </m:r>
+          </m:e>
+          <m:sup>
+            <m:r>
+              <m:t>3</m:t>
+            </m:r>
+          </m:sup>
+        </m:sSup>
+      </m:oMath>
+      <w:r>
+        <w:t xml:space="preserve">), the failure mode traced in the section on why the measurements failed.</w:t>
       </w:r>
     </w:p>
     <w:p>
@@ -27216,7 +27576,7 @@
         </m:r>
       </m:oMath>
       <w:r>
-        <w:t xml:space="preserve">gradient saliency within 10 mm of the suggestion was 0.15 for true positives and 0.16 for false positives (Figure 4.18): the detector looks at the local region in both cases, and false positives come from local structures that resemble nodules, such as vessels seen end-on, not from attention elsewhere.</w:t>
+        <w:t xml:space="preserve">gradient saliency within 10 mm of the suggestion was 0.15 for true positives and 0.16 for false positives (Figure 4.21): the detector looks at the local region in both cases, and false positives come from local structures that resemble nodules, such as vessels seen end-on, not from attention elsewhere.</w:t>
       </w:r>
     </w:p>
     <w:p>
@@ -27229,18 +27589,18 @@
           <wp:inline>
             <wp:extent cx="5334000" cy="6578599"/>
             <wp:effectExtent b="0" l="0" r="0" t="0"/>
-            <wp:docPr descr="image" title="" id="164" name="Picture"/>
+            <wp:docPr descr="image" title="" id="170" name="Picture"/>
             <a:graphic>
               <a:graphicData uri="http://schemas.openxmlformats.org/drawingml/2006/picture">
                 <pic:pic>
                   <pic:nvPicPr>
-                    <pic:cNvPr descr="/home/user/medlift3d/report/figures/results/seen_unseen_example.png" id="165" name="Picture"/>
+                    <pic:cNvPr descr="/home/user/medlift3d/report/figures/results/seen_unseen_example.png" id="171" name="Picture"/>
                     <pic:cNvPicPr>
                       <a:picLocks noChangeArrowheads="1" noChangeAspect="1"/>
                     </pic:cNvPicPr>
                   </pic:nvPicPr>
                   <pic:blipFill>
-                    <a:blip r:embed="rId163"/>
+                    <a:blip r:embed="rId169"/>
                     <a:stretch>
                       <a:fillRect/>
                     </a:stretch>
@@ -27280,7 +27640,7 @@
           <w:i/>
           <w:sz w:val="20"/>
         </w:rPr>
-        <w:t xml:space="preserve">Figure 4.17:</w:t>
+        <w:t xml:space="preserve">Figure 4.19:</w:t>
       </w:r>
       <w:r>
         <w:rPr>
@@ -27307,20 +27667,100 @@
       <w:r>
         <w:drawing>
           <wp:inline>
-            <wp:extent cx="5334000" cy="1839310"/>
+            <wp:extent cx="5334000" cy="6578599"/>
             <wp:effectExtent b="0" l="0" r="0" t="0"/>
-            <wp:docPr descr="image" title="" id="167" name="Picture"/>
+            <wp:docPr descr="image" title="" id="173" name="Picture"/>
             <a:graphic>
               <a:graphicData uri="http://schemas.openxmlformats.org/drawingml/2006/picture">
                 <pic:pic>
                   <pic:nvPicPr>
-                    <pic:cNvPr descr="/home/user/medlift3d/report/figures/results/saliency_examples.png" id="168" name="Picture"/>
+                    <pic:cNvPr descr="/home/user/medlift3d/report/figures/results/seen_unseen_example2.png" id="174" name="Picture"/>
                     <pic:cNvPicPr>
                       <a:picLocks noChangeArrowheads="1" noChangeAspect="1"/>
                     </pic:cNvPicPr>
                   </pic:nvPicPr>
                   <pic:blipFill>
-                    <a:blip r:embed="rId166"/>
+                    <a:blip r:embed="rId172"/>
+                    <a:stretch>
+                      <a:fillRect/>
+                    </a:stretch>
+                  </pic:blipFill>
+                  <pic:spPr bwMode="auto">
+                    <a:xfrm>
+                      <a:off x="0" y="0"/>
+                      <a:ext cx="5334000" cy="6578599"/>
+                    </a:xfrm>
+                    <a:prstGeom prst="rect">
+                      <a:avLst/>
+                    </a:prstGeom>
+                    <a:noFill/>
+                    <a:ln w="9525">
+                      <a:noFill/>
+                      <a:headEnd/>
+                      <a:tailEnd/>
+                    </a:ln>
+                  </pic:spPr>
+                </pic:pic>
+              </a:graphicData>
+            </a:graphic>
+          </wp:inline>
+        </w:drawing>
+      </w:r>
+    </w:p>
+    <w:p>
+      <w:pPr>
+        <w:pStyle w:val="BodyText"/>
+        <w:jc w:val="center"/>
+      </w:pPr>
+      <w:r>
+        <w:rPr>
+          <w:bCs/>
+          <w:b/>
+          <w:iCs/>
+          <w:i/>
+          <w:sz w:val="20"/>
+        </w:rPr>
+        <w:t xml:space="preserve">Figure 4.20:</w:t>
+      </w:r>
+      <w:r>
+        <w:rPr>
+          <w:iCs/>
+          <w:i/>
+          <w:sz w:val="20"/>
+        </w:rPr>
+        <w:t xml:space="preserve"> </w:t>
+      </w:r>
+      <w:r>
+        <w:rPr>
+          <w:iCs/>
+          <w:i/>
+          <w:sz w:val="20"/>
+        </w:rPr>
+        <w:t xml:space="preserve">Seen/unseen split for a second test nodule (LIDC-IDRI-0018, 11.6 mm): the diffusion prior recovers depth that the views miss, while the Gaussian fit loses the nodule.</w:t>
+      </w:r>
+    </w:p>
+    <w:p>
+      <w:pPr>
+        <w:pStyle w:val="BodyText"/>
+        <w:jc w:val="center"/>
+      </w:pPr>
+      <w:r>
+        <w:drawing>
+          <wp:inline>
+            <wp:extent cx="5334000" cy="1839310"/>
+            <wp:effectExtent b="0" l="0" r="0" t="0"/>
+            <wp:docPr descr="image" title="" id="176" name="Picture"/>
+            <a:graphic>
+              <a:graphicData uri="http://schemas.openxmlformats.org/drawingml/2006/picture">
+                <pic:pic>
+                  <pic:nvPicPr>
+                    <pic:cNvPr descr="/home/user/medlift3d/report/figures/results/saliency_examples.png" id="177" name="Picture"/>
+                    <pic:cNvPicPr>
+                      <a:picLocks noChangeArrowheads="1" noChangeAspect="1"/>
+                    </pic:cNvPicPr>
+                  </pic:nvPicPr>
+                  <pic:blipFill>
+                    <a:blip r:embed="rId175"/>
                     <a:stretch>
                       <a:fillRect/>
                     </a:stretch>
@@ -27360,7 +27800,7 @@
           <w:i/>
           <w:sz w:val="20"/>
         </w:rPr>
-        <w:t xml:space="preserve">Figure 4.18:</w:t>
+        <w:t xml:space="preserve">Figure 4.21:</w:t>
       </w:r>
       <w:r>
         <w:rPr>
@@ -27395,8 +27835,8 @@
         <w:t xml:space="preserve">gradient saliency of the detector for true and false positive suggestions (coronal and depth views).</w:t>
       </w:r>
     </w:p>
-    <w:bookmarkEnd w:id="169"/>
-    <w:bookmarkStart w:id="173" w:name="why-the-measurements-failed"/>
+    <w:bookmarkEnd w:id="178"/>
+    <w:bookmarkStart w:id="182" w:name="why-the-measurements-failed"/>
     <w:p>
       <w:pPr>
         <w:pStyle w:val="Heading3"/>
@@ -27431,7 +27871,7 @@
         <w:t xml:space="preserve"> </w:t>
       </w:r>
       <w:r>
-        <w:t xml:space="preserve">Training pairs were cut around nodules and around nodule-free lung, and the prior was not told that a nodule is present at the click. For faint nodules it often produces plausible normal lung instead, which is consistent with the strong negative bias, the larger errors of low-density nodules and the low ensemble spread on failures. Figure 4.19 shows such a case. A fix is to condition the prior on the click or oversample nodule pairs.</w:t>
+        <w:t xml:space="preserve">Training pairs were cut around nodules and around nodule-free lung, and the prior was not told that a nodule is present at the click. For faint nodules it often produces plausible normal lung instead, which is consistent with the strong negative bias, the larger errors of low-density nodules and the low ensemble spread on failures. Figure 4.22 shows such a case. A fix is to condition the prior on the click or oversample nodule pairs.</w:t>
       </w:r>
     </w:p>
     <w:p>
@@ -27504,18 +27944,18 @@
           <wp:inline>
             <wp:extent cx="5334000" cy="9724759"/>
             <wp:effectExtent b="0" l="0" r="0" t="0"/>
-            <wp:docPr descr="image" title="" id="171" name="Picture"/>
+            <wp:docPr descr="image" title="" id="180" name="Picture"/>
             <a:graphic>
               <a:graphicData uri="http://schemas.openxmlformats.org/drawingml/2006/picture">
                 <pic:pic>
                   <pic:nvPicPr>
-                    <pic:cNvPr descr="/home/user/medlift3d/report/figures/results/nodule_example.png" id="172" name="Picture"/>
+                    <pic:cNvPr descr="/home/user/medlift3d/report/figures/results/nodule_example.png" id="181" name="Picture"/>
                     <pic:cNvPicPr>
                       <a:picLocks noChangeArrowheads="1" noChangeAspect="1"/>
                     </pic:cNvPicPr>
                   </pic:nvPicPr>
                   <pic:blipFill>
-                    <a:blip r:embed="rId170"/>
+                    <a:blip r:embed="rId179"/>
                     <a:stretch>
                       <a:fillRect/>
                     </a:stretch>
@@ -27555,7 +27995,7 @@
           <w:i/>
           <w:sz w:val="20"/>
         </w:rPr>
-        <w:t xml:space="preserve">Figure 4.19:</w:t>
+        <w:t xml:space="preserve">Figure 4.22:</w:t>
       </w:r>
       <w:r>
         <w:rPr>
@@ -27574,8 +28014,8 @@
         <w:t xml:space="preserve">One test nodule (LIDC-IDRI-0004, 6.8 mm) through all methods: CT truth, the DTS input, and each reconstruction with its segmentation (red) and sample spread (right).</w:t>
       </w:r>
     </w:p>
-    <w:bookmarkEnd w:id="173"/>
-    <w:bookmarkStart w:id="174" w:name="acquisition-geometry-sensitivity"/>
+    <w:bookmarkEnd w:id="182"/>
+    <w:bookmarkStart w:id="183" w:name="acquisition-geometry-sensitivity"/>
     <w:p>
       <w:pPr>
         <w:pStyle w:val="Heading3"/>
@@ -27592,8 +28032,8 @@
         <w:t xml:space="preserve">On 12 nodules of two test patients, the depth smear (depth over in-plane width of the artifact spread) was 5.13 for 15 views over 30°, 5.34 for 60 views over 30° (four times the compute), 4.69 for 15 views over 40° and 4.61 for 74 views over 40°, against 0.95 for CT. At equal dose the number of views hardly matters, while a 40° sweep reduces the smear by about 9%; our 15-view, 30° setting is therefore the conservative case.</w:t>
       </w:r>
     </w:p>
-    <w:bookmarkEnd w:id="174"/>
-    <w:bookmarkStart w:id="190" w:name="application"/>
+    <w:bookmarkEnd w:id="183"/>
+    <w:bookmarkStart w:id="199" w:name="application"/>
     <w:p>
       <w:pPr>
         <w:pStyle w:val="Heading3"/>
@@ -27607,7 +28047,7 @@
         <w:pStyle w:val="FirstParagraph"/>
       </w:pPr>
       <w:r>
-        <w:t xml:space="preserve">Measuring one nodule with all five reconstruction methods took a median of 45.5 s. The application loads the trained models on a free Kaggle notebook and is reached from a browser through an HTTPS tunnel. For a click on an annotated nodule it returns mass and volume with intervals, the EUPS category with probabilities, the prism views with the sample spread, and an interactive 3D view in which the reconstruction is coloured by the disagreement of the eight samples and the radiologists’ nodule is shown in grey (Figure 4.20); in both views the uncertainty is largest in depth, as the physics predicts. A click where no nodule exists returns</w:t>
+        <w:t xml:space="preserve">Measuring one nodule with all five reconstruction methods took a median of 45.5 s. The application loads the trained models on a free Kaggle notebook and is reached from a browser through an HTTPS tunnel. For a click on an annotated nodule it returns mass and volume with intervals, the EUPS category with probabilities, the prism views with the sample spread, and an interactive 3D view in which the reconstruction is coloured by the disagreement of the eight samples and the radiologists’ nodule is shown in grey (Figure 4.23); in both views the uncertainty is largest in depth, as the physics predicts. A click where no nodule exists returns</w:t>
       </w:r>
       <w:r>
         <w:t xml:space="preserve"> </w:t>
@@ -27638,18 +28078,18 @@
           <wp:inline>
             <wp:extent cx="5334000" cy="2389679"/>
             <wp:effectExtent b="0" l="0" r="0" t="0"/>
-            <wp:docPr descr="image" title="" id="176" name="Picture"/>
+            <wp:docPr descr="image" title="" id="185" name="Picture"/>
             <a:graphic>
               <a:graphicData uri="http://schemas.openxmlformats.org/drawingml/2006/picture">
                 <pic:pic>
                   <pic:nvPicPr>
-                    <pic:cNvPr descr="/home/user/medlift3d/report/figures/results/demo_3d_a.png" id="177" name="Picture"/>
+                    <pic:cNvPr descr="/home/user/medlift3d/report/figures/results/demo_3d_a.png" id="186" name="Picture"/>
                     <pic:cNvPicPr>
                       <a:picLocks noChangeArrowheads="1" noChangeAspect="1"/>
                     </pic:cNvPicPr>
                   </pic:nvPicPr>
                   <pic:blipFill>
-                    <a:blip r:embed="rId175"/>
+                    <a:blip r:embed="rId184"/>
                     <a:stretch>
                       <a:fillRect/>
                     </a:stretch>
@@ -27700,18 +28140,18 @@
           <wp:inline>
             <wp:extent cx="5334000" cy="2389679"/>
             <wp:effectExtent b="0" l="0" r="0" t="0"/>
-            <wp:docPr descr="image" title="" id="179" name="Picture"/>
+            <wp:docPr descr="image" title="" id="188" name="Picture"/>
             <a:graphic>
               <a:graphicData uri="http://schemas.openxmlformats.org/drawingml/2006/picture">
                 <pic:pic>
                   <pic:nvPicPr>
-                    <pic:cNvPr descr="/home/user/medlift3d/report/figures/results/demo_3d_b.png" id="180" name="Picture"/>
+                    <pic:cNvPr descr="/home/user/medlift3d/report/figures/results/demo_3d_b.png" id="189" name="Picture"/>
                     <pic:cNvPicPr>
                       <a:picLocks noChangeArrowheads="1" noChangeAspect="1"/>
                     </pic:cNvPicPr>
                   </pic:nvPicPr>
                   <pic:blipFill>
-                    <a:blip r:embed="rId178"/>
+                    <a:blip r:embed="rId187"/>
                     <a:stretch>
                       <a:fillRect/>
                     </a:stretch>
@@ -27765,7 +28205,7 @@
           <w:i/>
           <w:sz w:val="20"/>
         </w:rPr>
-        <w:t xml:space="preserve">Figure 4.20:</w:t>
+        <w:t xml:space="preserve">Figure 4.23:</w:t>
       </w:r>
       <w:r>
         <w:rPr>
@@ -27789,7 +28229,7 @@
         <w:pStyle w:val="BodyText"/>
       </w:pPr>
       <w:r>
-        <w:t xml:space="preserve">The application also shows the prism around the click in the coronal plane (what DTS shows) and the sagittal plane (depth, where DTS is blind), together with the mean reconstruction, its segmentation and the sample spread (Figure 4.21). For a solid, well-contrasted nodule the segmentation follows the nodule and the spread is concentrated at its border; for a faint nodule the reconstruction is smaller and less certain; and the physics-only Gaussians can fail completely near the chest wall, where the spread is high everywhere and no nodule is found.</w:t>
+        <w:t xml:space="preserve">The application also shows the prism around the click in the coronal plane (what DTS shows) and the sagittal plane (depth, where DTS is blind), together with the mean reconstruction, its segmentation and the sample spread (Figure 4.24). For a solid, well-contrasted nodule the segmentation follows the nodule and the spread is concentrated at its border; for a faint nodule the reconstruction is smaller and less certain; and the physics-only Gaussians can fail completely near the chest wall, where the spread is high everywhere and no nodule is found.</w:t>
       </w:r>
     </w:p>
     <w:p>
@@ -27802,18 +28242,18 @@
           <wp:inline>
             <wp:extent cx="5334000" cy="2784661"/>
             <wp:effectExtent b="0" l="0" r="0" t="0"/>
-            <wp:docPr descr="image" title="" id="182" name="Picture"/>
+            <wp:docPr descr="image" title="" id="191" name="Picture"/>
             <a:graphic>
               <a:graphicData uri="http://schemas.openxmlformats.org/drawingml/2006/picture">
                 <pic:pic>
                   <pic:nvPicPr>
-                    <pic:cNvPr descr="/home/user/medlift3d/report/figures/results/demo_roi_solid.png" id="183" name="Picture"/>
+                    <pic:cNvPr descr="/home/user/medlift3d/report/figures/results/demo_roi_solid.png" id="192" name="Picture"/>
                     <pic:cNvPicPr>
                       <a:picLocks noChangeArrowheads="1" noChangeAspect="1"/>
                     </pic:cNvPicPr>
                   </pic:nvPicPr>
                   <pic:blipFill>
-                    <a:blip r:embed="rId181"/>
+                    <a:blip r:embed="rId190"/>
                     <a:stretch>
                       <a:fillRect/>
                     </a:stretch>
@@ -27864,18 +28304,18 @@
           <wp:inline>
             <wp:extent cx="5334000" cy="2784661"/>
             <wp:effectExtent b="0" l="0" r="0" t="0"/>
-            <wp:docPr descr="image" title="" id="185" name="Picture"/>
+            <wp:docPr descr="image" title="" id="194" name="Picture"/>
             <a:graphic>
               <a:graphicData uri="http://schemas.openxmlformats.org/drawingml/2006/picture">
                 <pic:pic>
                   <pic:nvPicPr>
-                    <pic:cNvPr descr="/home/user/medlift3d/report/figures/results/demo_roi_faint.png" id="186" name="Picture"/>
+                    <pic:cNvPr descr="/home/user/medlift3d/report/figures/results/demo_roi_faint.png" id="195" name="Picture"/>
                     <pic:cNvPicPr>
                       <a:picLocks noChangeArrowheads="1" noChangeAspect="1"/>
                     </pic:cNvPicPr>
                   </pic:nvPicPr>
                   <pic:blipFill>
-                    <a:blip r:embed="rId184"/>
+                    <a:blip r:embed="rId193"/>
                     <a:stretch>
                       <a:fillRect/>
                     </a:stretch>
@@ -27926,18 +28366,18 @@
           <wp:inline>
             <wp:extent cx="5334000" cy="2784661"/>
             <wp:effectExtent b="0" l="0" r="0" t="0"/>
-            <wp:docPr descr="image" title="" id="188" name="Picture"/>
+            <wp:docPr descr="image" title="" id="197" name="Picture"/>
             <a:graphic>
               <a:graphicData uri="http://schemas.openxmlformats.org/drawingml/2006/picture">
                 <pic:pic>
                   <pic:nvPicPr>
-                    <pic:cNvPr descr="/home/user/medlift3d/report/figures/results/demo_roi_physics.png" id="189" name="Picture"/>
+                    <pic:cNvPr descr="/home/user/medlift3d/report/figures/results/demo_roi_physics.png" id="198" name="Picture"/>
                     <pic:cNvPicPr>
                       <a:picLocks noChangeArrowheads="1" noChangeAspect="1"/>
                     </pic:cNvPicPr>
                   </pic:nvPicPr>
                   <pic:blipFill>
-                    <a:blip r:embed="rId187"/>
+                    <a:blip r:embed="rId196"/>
                     <a:stretch>
                       <a:fillRect/>
                     </a:stretch>
@@ -27991,7 +28431,7 @@
           <w:i/>
           <w:sz w:val="20"/>
         </w:rPr>
-        <w:t xml:space="preserve">Figure 4.21:</w:t>
+        <w:t xml:space="preserve">Figure 4.24:</w:t>
       </w:r>
       <w:r>
         <w:rPr>
@@ -28010,9 +28450,9 @@
         <w:t xml:space="preserve">Prism views in the application: DTS input (top row of each panel) and reconstruction with its segmentation (red) and sample standard deviation (bottom row), coronal and sagittal (depth).</w:t>
       </w:r>
     </w:p>
-    <w:bookmarkEnd w:id="190"/>
-    <w:bookmarkEnd w:id="191"/>
-    <w:bookmarkStart w:id="192" w:name="summary-2"/>
+    <w:bookmarkEnd w:id="199"/>
+    <w:bookmarkEnd w:id="200"/>
+    <w:bookmarkStart w:id="201" w:name="summary-2"/>
     <w:p>
       <w:pPr>
         <w:pStyle w:val="Heading2"/>
@@ -28065,9 +28505,9 @@
         <w:t xml:space="preserve">from 0.54 to 0.17, and the seen/unseen analysis showed that the nodule’s mass is fully measured by the X-rays and that the prior’s unseen content correlates with the truth. The measurements themselves did not reach the goal: H1 and H2 were not supported, H4 was not supported for our method, and the intervals, although valid, were too wide to be useful. The analysis traced these failures to a prior that shrinks faint nodules, to measuring mass in image space rather than from the projections, and to failed measurements inside the calibration set. These are concrete, testable fixes rather than open questions.</w:t>
       </w:r>
     </w:p>
-    <w:bookmarkEnd w:id="192"/>
-    <w:bookmarkEnd w:id="193"/>
-    <w:bookmarkStart w:id="213" w:name="Xe33e6638723adaf4d164c498c86f35038b40f7b"/>
+    <w:bookmarkEnd w:id="201"/>
+    <w:bookmarkEnd w:id="202"/>
+    <w:bookmarkStart w:id="222" w:name="Xe33e6638723adaf4d164c498c86f35038b40f7b"/>
     <w:p>
       <w:pPr>
         <w:pStyle w:val="Heading1"/>
@@ -28084,7 +28524,7 @@
         <w:t xml:space="preserve">This chapter lists the standards MedLift-3D follows, with the alternatives considered, and analyses its economic, environmental, ethical, health and safety, social, political, legal, cultural and sustainability aspects. It ends with the cost analysis and the complex engineering problem mapping.</w:t>
       </w:r>
     </w:p>
-    <w:bookmarkStart w:id="197" w:name="compliance-with-the-standards"/>
+    <w:bookmarkStart w:id="206" w:name="compliance-with-the-standards"/>
     <w:p>
       <w:pPr>
         <w:pStyle w:val="Heading2"/>
@@ -28101,7 +28541,7 @@
         <w:t xml:space="preserve">MedLift-3D is research software intended to become medical-device software, so we followed the standards that such software must eventually meet, even where formal certification is out of scope for a student project. For each standard we state how it is applied, which alternatives were considered with their pros and cons, and why it was selected. The standards are grouped into software, hardware and communication standards.</w:t>
       </w:r>
     </w:p>
-    <w:bookmarkStart w:id="194" w:name="software-standards"/>
+    <w:bookmarkStart w:id="203" w:name="software-standards"/>
     <w:p>
       <w:pPr>
         <w:pStyle w:val="Heading3"/>
@@ -28842,8 +29282,8 @@
         </w:tc>
       </w:tr>
     </w:tbl>
-    <w:bookmarkEnd w:id="194"/>
-    <w:bookmarkStart w:id="195" w:name="hardware-standards"/>
+    <w:bookmarkEnd w:id="203"/>
+    <w:bookmarkStart w:id="204" w:name="hardware-standards"/>
     <w:p>
       <w:pPr>
         <w:pStyle w:val="Heading3"/>
@@ -29214,8 +29654,8 @@
         </w:tc>
       </w:tr>
     </w:tbl>
-    <w:bookmarkEnd w:id="195"/>
-    <w:bookmarkStart w:id="196" w:name="communication-standards"/>
+    <w:bookmarkEnd w:id="204"/>
+    <w:bookmarkStart w:id="205" w:name="communication-standards"/>
     <w:p>
       <w:pPr>
         <w:pStyle w:val="Heading3"/>
@@ -29586,9 +30026,9 @@
         </w:tc>
       </w:tr>
     </w:tbl>
-    <w:bookmarkEnd w:id="196"/>
-    <w:bookmarkEnd w:id="197"/>
-    <w:bookmarkStart w:id="207" w:name="design-constraints"/>
+    <w:bookmarkEnd w:id="205"/>
+    <w:bookmarkEnd w:id="206"/>
+    <w:bookmarkStart w:id="216" w:name="design-constraints"/>
     <w:p>
       <w:pPr>
         <w:pStyle w:val="Heading2"/>
@@ -29605,7 +30045,7 @@
         <w:t xml:space="preserve">The design was shaped by economic, environmental, ethical, health and safety, social, political, sustainability, legal and cultural constraints. Each is discussed below together with its effect on the design and the measures taken.</w:t>
       </w:r>
     </w:p>
-    <w:bookmarkStart w:id="198" w:name="economic-constraint"/>
+    <w:bookmarkStart w:id="207" w:name="economic-constraint"/>
     <w:p>
       <w:pPr>
         <w:pStyle w:val="Heading3"/>
@@ -29622,8 +30062,8 @@
         <w:t xml:space="preserve">The project had no external funding, so all computation had to fit a student budget. Free resources were used wherever possible (laptop CPU, Kaggle GPUs for the pilot and the application), CPU-only steps (download and case building) were moved to a cheap CPU machine, and GPU training was given a fixed compute budget. Clinically, the economic case rests on DTS: a DTS-capable radiography room costs a fraction of a CT scanner and examines patients faster, so follow-up by DTS can lower the cost of each follow-up for hospitals and patients.</w:t>
       </w:r>
     </w:p>
-    <w:bookmarkEnd w:id="198"/>
-    <w:bookmarkStart w:id="199" w:name="environmental-constraint"/>
+    <w:bookmarkEnd w:id="207"/>
+    <w:bookmarkStart w:id="208" w:name="environmental-constraint"/>
     <w:p>
       <w:pPr>
         <w:pStyle w:val="Heading3"/>
@@ -29724,8 +30164,8 @@
         <w:t xml:space="preserve">A small model (17.4 M parameters) instead of a large generator; a prism instead of whole-volume generation; fixed compute budgets; CPU work on CPU machines; trained models reused for evaluation and the application instead of retraining; and, for future runs, cloud regions powered by renewable energy.</w:t>
       </w:r>
     </w:p>
-    <w:bookmarkEnd w:id="199"/>
-    <w:bookmarkStart w:id="200" w:name="ethical-constraint"/>
+    <w:bookmarkEnd w:id="208"/>
+    <w:bookmarkStart w:id="209" w:name="ethical-constraint"/>
     <w:p>
       <w:pPr>
         <w:pStyle w:val="Heading3"/>
@@ -29891,8 +30331,8 @@
         <w:t xml:space="preserve">The team owns its decisions and mistakes. When the real-data pilot showed that the prism lost a third of its attenuation, we traced the cause to our own missing depth support and fixed it before the full run; when the first design of the project could not be verified, we narrowed it rather than present training losses as success. Each step’s owner (Table 3.7) is accountable for its checks. The system is decision support: the responsibility for a diagnosis stays with the radiologist.</w:t>
       </w:r>
     </w:p>
-    <w:bookmarkEnd w:id="200"/>
-    <w:bookmarkStart w:id="201" w:name="health-and-safety-constraint"/>
+    <w:bookmarkEnd w:id="209"/>
+    <w:bookmarkStart w:id="210" w:name="health-and-safety-constraint"/>
     <w:p>
       <w:pPr>
         <w:pStyle w:val="Heading3"/>
@@ -30539,8 +30979,8 @@
         </w:tc>
       </w:tr>
     </w:tbl>
-    <w:bookmarkEnd w:id="201"/>
-    <w:bookmarkStart w:id="202" w:name="social-constraint"/>
+    <w:bookmarkEnd w:id="210"/>
+    <w:bookmarkStart w:id="211" w:name="social-constraint"/>
     <w:p>
       <w:pPr>
         <w:pStyle w:val="Heading3"/>
@@ -30557,8 +30997,8 @@
         <w:t xml:space="preserve">In the short term, DTS-based follow-up could shorten CT waiting lists and reduce travel for patients outside major cities. In the long term it could make nodule surveillance, and later screening, feasible where CT capacity is the bottleneck, improving early diagnosis where the survival gain is largest. From the patient’s perspective this means less dose and cost; from the radiologist’s, a measurement tool with honest uncertainty; from the health system’s, cheaper follow-up that needs training and local validation. Possible negative effects are over-diagnosis if many more people are followed, and a widening gap if only private hospitals adopt the tool; both argue for public-sector deployment and guideline-based use.</w:t>
       </w:r>
     </w:p>
-    <w:bookmarkEnd w:id="202"/>
-    <w:bookmarkStart w:id="203" w:name="political-constraint"/>
+    <w:bookmarkEnd w:id="211"/>
+    <w:bookmarkStart w:id="212" w:name="political-constraint"/>
     <w:p>
       <w:pPr>
         <w:pStyle w:val="Heading3"/>
@@ -30575,8 +31015,8 @@
         <w:t xml:space="preserve">Adoption of health technology depends on public health policy and procurement. In Bangladesh, imaging equipment and software are purchased mainly through government tenders and large private hospital groups, so adoption would need evidence accepted by the health authorities and inclusion in national cancer-control plans. The use of foreign cloud computing for health data is itself a policy question, so a deployment should keep data and computation in the country.</w:t>
       </w:r>
     </w:p>
-    <w:bookmarkEnd w:id="203"/>
-    <w:bookmarkStart w:id="204" w:name="sustainability"/>
+    <w:bookmarkEnd w:id="212"/>
+    <w:bookmarkStart w:id="213" w:name="sustainability"/>
     <w:p>
       <w:pPr>
         <w:pStyle w:val="Heading3"/>
@@ -30663,8 +31103,8 @@
         <w:t xml:space="preserve">documented and tested code that another team can maintain, and a method that extends to other limited-angle modalities.</w:t>
       </w:r>
     </w:p>
-    <w:bookmarkEnd w:id="204"/>
-    <w:bookmarkStart w:id="205" w:name="legal-considerations"/>
+    <w:bookmarkEnd w:id="213"/>
+    <w:bookmarkStart w:id="214" w:name="legal-considerations"/>
     <w:p>
       <w:pPr>
         <w:pStyle w:val="Heading3"/>
@@ -30778,8 +31218,8 @@
         <w:t xml:space="preserve">the intended use is decision support; the clinician remains responsible for the diagnosis.</w:t>
       </w:r>
     </w:p>
-    <w:bookmarkEnd w:id="205"/>
-    <w:bookmarkStart w:id="206" w:name="cultural-considerations"/>
+    <w:bookmarkEnd w:id="214"/>
+    <w:bookmarkStart w:id="215" w:name="cultural-considerations"/>
     <w:p>
       <w:pPr>
         <w:pStyle w:val="Heading3"/>
@@ -30893,9 +31333,9 @@
         <w:t xml:space="preserve">many patients trust the doctor more than a machine; keeping the clinician in charge respects this.</w:t>
       </w:r>
     </w:p>
-    <w:bookmarkEnd w:id="206"/>
-    <w:bookmarkEnd w:id="207"/>
-    <w:bookmarkStart w:id="208" w:name="cost-analysis"/>
+    <w:bookmarkEnd w:id="215"/>
+    <w:bookmarkEnd w:id="216"/>
+    <w:bookmarkStart w:id="217" w:name="cost-analysis"/>
     <w:p>
       <w:pPr>
         <w:pStyle w:val="Heading2"/>
@@ -32065,8 +32505,8 @@
         <w:t xml:space="preserve">Under these assumptions the venture breaks even early in year four. The largest uncertainty is the cost and duration of clinical validation, which is why a partnership with a public hospital is the first step.</w:t>
       </w:r>
     </w:p>
-    <w:bookmarkEnd w:id="208"/>
-    <w:bookmarkStart w:id="211" w:name="complex-engineering-problem"/>
+    <w:bookmarkEnd w:id="217"/>
+    <w:bookmarkStart w:id="220" w:name="complex-engineering-problem"/>
     <w:p>
       <w:pPr>
         <w:pStyle w:val="Heading2"/>
@@ -32083,7 +32523,7 @@
         <w:t xml:space="preserve">MedLift-3D is a complex engineering problem: it is ill-posed by physics, combines X-ray physics, generative AI and statistics, has conflicting requirements (dose, accuracy, honesty, cost), and has direct consequences for patients.</w:t>
       </w:r>
     </w:p>
-    <w:bookmarkStart w:id="209" w:name="complex-problem-solving"/>
+    <w:bookmarkStart w:id="218" w:name="complex-problem-solving"/>
     <w:p>
       <w:pPr>
         <w:pStyle w:val="Heading3"/>
@@ -32936,8 +33376,8 @@
         <w:t xml:space="preserve">Simulation, reconstruction, prior, Gaussians, calibration and detector depend on each other: the depth-support bug in reconstruction, for example, corrupted the training data and every downstream measurement until it was fixed.</w:t>
       </w:r>
     </w:p>
-    <w:bookmarkEnd w:id="209"/>
-    <w:bookmarkStart w:id="210" w:name="engineering-activities"/>
+    <w:bookmarkEnd w:id="218"/>
+    <w:bookmarkStart w:id="219" w:name="engineering-activities"/>
     <w:p>
       <w:pPr>
         <w:pStyle w:val="Heading3"/>
@@ -33280,9 +33720,9 @@
         <w:t xml:space="preserve">Diffusion models, conformal predictive systems and null-space analysis go well beyond typical undergraduate projects and were learned during the project.</w:t>
       </w:r>
     </w:p>
-    <w:bookmarkEnd w:id="210"/>
-    <w:bookmarkEnd w:id="211"/>
-    <w:bookmarkStart w:id="212" w:name="summary-3"/>
+    <w:bookmarkEnd w:id="219"/>
+    <w:bookmarkEnd w:id="220"/>
+    <w:bookmarkStart w:id="221" w:name="summary-3"/>
     <w:p>
       <w:pPr>
         <w:pStyle w:val="Heading2"/>
@@ -33299,9 +33739,9 @@
         <w:t xml:space="preserve">MedLift-3D follows the software, hardware and communication standards relevant to medical imaging software and prepares for IEC 62304 and ISO 14971. Its main impacts are positive (lower dose and cost, wider access), with clear risks (wrong measurements, over-trust, untested populations) that the design mitigates through calibrated intervals, flags, clinician control and a validation plan. It meets the attributes of a complex engineering problem.</w:t>
       </w:r>
     </w:p>
-    <w:bookmarkEnd w:id="212"/>
-    <w:bookmarkEnd w:id="213"/>
-    <w:bookmarkStart w:id="223" w:name="chapter-6-conclusion"/>
+    <w:bookmarkEnd w:id="221"/>
+    <w:bookmarkEnd w:id="222"/>
+    <w:bookmarkStart w:id="232" w:name="chapter-6-conclusion"/>
     <w:p>
       <w:pPr>
         <w:pStyle w:val="Heading1"/>
@@ -33318,7 +33758,7 @@
         <w:t xml:space="preserve">This chapter summarises what MedLift-3D achieved, states its limitations and future work, and reflects on the independent learning the project required.</w:t>
       </w:r>
     </w:p>
-    <w:bookmarkStart w:id="214" w:name="summary-4"/>
+    <w:bookmarkStart w:id="223" w:name="summary-4"/>
     <w:p>
       <w:pPr>
         <w:pStyle w:val="Heading2"/>
@@ -33371,8 +33811,8 @@
         <w:t xml:space="preserve">from 0.54 to 0.17, and the null-space analysis showed that the X-rays measure almost all of a nodule’s mass and that the prior’s unseen content correlates with the truth. The measurements did not reach the goal: mass was not more accurate than volume (H1), the full method did not beat physics-only reconstruction (H2), MDT did not beat VDT for our method (H4), and the valid intervals were too wide to be useful (H3). Calibrated probabilities (H5) helped at one of two thresholds, and the prior’s positive unseen skill supports H6. The analysis traced the failures to specific causes with specific fixes, and showed that better image quality did not mean better measurement, which is itself a lesson for medical generative AI.</w:t>
       </w:r>
     </w:p>
-    <w:bookmarkEnd w:id="214"/>
-    <w:bookmarkStart w:id="215" w:name="limitation"/>
+    <w:bookmarkEnd w:id="223"/>
+    <w:bookmarkStart w:id="224" w:name="limitation"/>
     <w:p>
       <w:pPr>
         <w:pStyle w:val="Heading2"/>
@@ -33635,8 +34075,8 @@
         <w:t xml:space="preserve">was taken from the CT body outline; a real DTS unit would have to measure it.</w:t>
       </w:r>
     </w:p>
-    <w:bookmarkEnd w:id="215"/>
-    <w:bookmarkStart w:id="216" w:name="future-work"/>
+    <w:bookmarkEnd w:id="224"/>
+    <w:bookmarkStart w:id="225" w:name="future-work"/>
     <w:p>
       <w:pPr>
         <w:pStyle w:val="Heading2"/>
@@ -33873,8 +34313,8 @@
         <w:t xml:space="preserve">breast tomosynthesis and dental cone-beam CT share the missing-wedge structure.</w:t>
       </w:r>
     </w:p>
-    <w:bookmarkEnd w:id="216"/>
-    <w:bookmarkStart w:id="222" w:name="independent-learning-and-reflection"/>
+    <w:bookmarkEnd w:id="225"/>
+    <w:bookmarkStart w:id="231" w:name="independent-learning-and-reflection"/>
     <w:p>
       <w:pPr>
         <w:pStyle w:val="Heading2"/>
@@ -33891,7 +34331,7 @@
         <w:t xml:space="preserve">The project required knowledge and skills well beyond our coursework. This section reflects on that independent learning under five aspects: curiosity, self-initiative, independence, transfer of past learning, and reflection on what we learned.</w:t>
       </w:r>
     </w:p>
-    <w:bookmarkStart w:id="217" w:name="curiosity"/>
+    <w:bookmarkStart w:id="226" w:name="curiosity"/>
     <w:p>
       <w:pPr>
         <w:pStyle w:val="Heading3"/>
@@ -33908,8 +34348,8 @@
         <w:t xml:space="preserve">The project began as a generative-modelling idea, but we kept asking a deeper question: what can a 30° X-ray sweep actually measure? Following that question into projection moments led to the mass-first design. The same curiosity made us ask whether the prior recovers or invents depth, which became the seen/unseen analysis, and when we found that raw ensemble spread is not a probability we studied conformal prediction until we could produce calibrated category probabilities.</w:t>
       </w:r>
     </w:p>
-    <w:bookmarkEnd w:id="217"/>
-    <w:bookmarkStart w:id="218" w:name="self-initiative"/>
+    <w:bookmarkEnd w:id="226"/>
+    <w:bookmarkStart w:id="227" w:name="self-initiative"/>
     <w:p>
       <w:pPr>
         <w:pStyle w:val="Heading3"/>
@@ -33926,8 +34366,8 @@
         <w:t xml:space="preserve">Beyond the required scope we added a learned detector after the training-free one mostly found vessels, a fit check to show that the prior does not overfit, conformal predictive systems with size-group calibration, explainability with a truth-referenced test, a geometry-sensitivity study to justify the 15-view choice, and an automatic HTML report so that every check is visible to examiners.</w:t>
       </w:r>
     </w:p>
-    <w:bookmarkEnd w:id="218"/>
-    <w:bookmarkStart w:id="219" w:name="independence"/>
+    <w:bookmarkEnd w:id="227"/>
+    <w:bookmarkStart w:id="228" w:name="independence"/>
     <w:p>
       <w:pPr>
         <w:pStyle w:val="Heading3"/>
@@ -33944,8 +34384,8 @@
         <w:t xml:space="preserve">Outside the classroom we learned to run a long unattended job on rented cloud machines (CPU and GPU pods sharing a network volume, terminal multiplexing, resumable scripts and backups), to download and organise 64 GB of medical images from TCIA, to read radiologist annotations with pylidc, and to serve a GPU application from a Kaggle notebook through an HTTPS tunnel when the usual share link failed.</w:t>
       </w:r>
     </w:p>
-    <w:bookmarkEnd w:id="219"/>
-    <w:bookmarkStart w:id="220" w:name="transfer-of-past-learning"/>
+    <w:bookmarkEnd w:id="228"/>
+    <w:bookmarkStart w:id="229" w:name="transfer-of-past-learning"/>
     <w:p>
       <w:pPr>
         <w:pStyle w:val="Heading3"/>
@@ -34396,8 +34836,8 @@
         </w:tc>
       </w:tr>
     </w:tbl>
-    <w:bookmarkEnd w:id="220"/>
-    <w:bookmarkStart w:id="221" w:name="reflection-on-learning"/>
+    <w:bookmarkEnd w:id="229"/>
+    <w:bookmarkStart w:id="230" w:name="reflection-on-learning"/>
     <w:p>
       <w:pPr>
         <w:pStyle w:val="Heading3"/>
@@ -34414,10 +34854,10 @@
         <w:t xml:space="preserve">Our main lesson was that a large architecture with falling training losses does not show that a single clinical measurement is right. Rebuilding the work around measurable clinical numbers, explicit hypotheses and automatic checks changed how we think about engineering: a result counts only if someone else can verify it, and a negative result reported honestly is worth more than a claim that cannot be tested. We also learned to work within real limits of time, money and data, to plan computation like a budget, and to treat uncertainty as part of the answer rather than an embarrassment. These habits, more than any single model, are what we take from the project into our careers.</w:t>
       </w:r>
     </w:p>
-    <w:bookmarkEnd w:id="221"/>
-    <w:bookmarkEnd w:id="222"/>
-    <w:bookmarkEnd w:id="223"/>
-    <w:bookmarkStart w:id="226" w:name="references"/>
+    <w:bookmarkEnd w:id="230"/>
+    <w:bookmarkEnd w:id="231"/>
+    <w:bookmarkEnd w:id="232"/>
+    <w:bookmarkStart w:id="235" w:name="references"/>
     <w:p>
       <w:pPr>
         <w:pStyle w:val="Heading1"/>
@@ -34685,7 +35125,7 @@
       <w:r>
         <w:t xml:space="preserve"> </w:t>
       </w:r>
-      <w:hyperlink r:id="rId224">
+      <w:hyperlink r:id="rId233">
         <w:r>
           <w:rPr>
             <w:rStyle w:val="Hyperlink"/>
@@ -36509,7 +36949,7 @@
       <w:r>
         <w:t xml:space="preserve"> </w:t>
       </w:r>
-      <w:hyperlink r:id="rId225">
+      <w:hyperlink r:id="rId234">
         <w:r>
           <w:rPr>
             <w:rStyle w:val="Hyperlink"/>
@@ -36790,7 +37230,7 @@
         <w:t xml:space="preserve">. Personal data protection ordinance, 2025 (gazetted 6 november 2025), 2025.</w:t>
       </w:r>
     </w:p>
-    <w:bookmarkEnd w:id="226"/>
+    <w:bookmarkEnd w:id="235"/>
     <w:sectPr>
       <w:pgSz w:w="11909" w:h="16834"/>
       <w:pgMar w:left="1440" w:right="1440" w:top="1440" w:bottom="1440"/>

</xml_diff>